<commit_message>
Update Documentazione BariGo (1).docx
</commit_message>
<xml_diff>
--- a/doc/Documentazione BariGo (1).docx
+++ b/doc/Documentazione BariGo (1).docx
@@ -4,12 +4,12 @@
   <w:body>
     <w:p>
       <w:pPr>
-        <w:pStyle w:val="Title"/>
-      </w:pPr>
-    </w:p>
-    <w:p>
-      <w:pPr>
-        <w:pStyle w:val="Title"/>
+        <w:pStyle w:val="Titolo"/>
+      </w:pPr>
+    </w:p>
+    <w:p>
+      <w:pPr>
+        <w:pStyle w:val="Titolo"/>
       </w:pPr>
       <w:r>
         <w:t>BariGo</w:t>
@@ -19,12 +19,12 @@
       <w:pPr>
         <w:jc w:val="center"/>
         <w:rPr>
-          <w:rStyle w:val="Strong"/>
-        </w:rPr>
-      </w:pPr>
-      <w:r>
-        <w:rPr>
-          <w:rStyle w:val="Strong"/>
+          <w:rStyle w:val="Enfasigrassetto"/>
+        </w:rPr>
+      </w:pPr>
+      <w:r>
+        <w:rPr>
+          <w:rStyle w:val="Enfasigrassetto"/>
         </w:rPr>
         <w:t>Un’avventura culturale</w:t>
       </w:r>
@@ -347,7 +347,7 @@
     </w:p>
     <w:p>
       <w:pPr>
-        <w:pStyle w:val="Heading1"/>
+        <w:pStyle w:val="Titolo1"/>
       </w:pPr>
       <w:bookmarkStart w:id="0" w:name="_Toc41400375"/>
       <w:r>
@@ -358,7 +358,7 @@
     </w:p>
     <w:p>
       <w:pPr>
-        <w:pStyle w:val="TOC1"/>
+        <w:pStyle w:val="Sommario1"/>
         <w:tabs>
           <w:tab w:val="right" w:leader="dot" w:pos="9622"/>
         </w:tabs>
@@ -380,7 +380,7 @@
       <w:hyperlink w:anchor="_Toc41400374" w:history="1">
         <w:r>
           <w:rPr>
-            <w:rStyle w:val="Hyperlink"/>
+            <w:rStyle w:val="Collegamentoipertestuale"/>
             <w:noProof/>
           </w:rPr>
           <w:t>Titolo applicazione</w:t>
@@ -437,7 +437,7 @@
     </w:p>
     <w:p>
       <w:pPr>
-        <w:pStyle w:val="TOC1"/>
+        <w:pStyle w:val="Sommario1"/>
         <w:tabs>
           <w:tab w:val="right" w:leader="dot" w:pos="9622"/>
         </w:tabs>
@@ -450,7 +450,7 @@
       <w:hyperlink w:anchor="_Toc41400375" w:history="1">
         <w:r>
           <w:rPr>
-            <w:rStyle w:val="Hyperlink"/>
+            <w:rStyle w:val="Collegamentoipertestuale"/>
             <w:noProof/>
           </w:rPr>
           <w:t>INDICE</w:t>
@@ -507,7 +507,7 @@
     </w:p>
     <w:p>
       <w:pPr>
-        <w:pStyle w:val="TOC1"/>
+        <w:pStyle w:val="Sommario1"/>
         <w:tabs>
           <w:tab w:val="right" w:leader="dot" w:pos="9622"/>
         </w:tabs>
@@ -520,7 +520,7 @@
       <w:hyperlink w:anchor="_Toc41400376" w:history="1">
         <w:r>
           <w:rPr>
-            <w:rStyle w:val="Hyperlink"/>
+            <w:rStyle w:val="Collegamentoipertestuale"/>
             <w:noProof/>
           </w:rPr>
           <w:t>Pianificazione</w:t>
@@ -577,7 +577,7 @@
     </w:p>
     <w:p>
       <w:pPr>
-        <w:pStyle w:val="TOC2"/>
+        <w:pStyle w:val="Sommario2"/>
         <w:tabs>
           <w:tab w:val="right" w:leader="dot" w:pos="9622"/>
         </w:tabs>
@@ -590,7 +590,7 @@
       <w:hyperlink w:anchor="_Toc41400377" w:history="1">
         <w:r>
           <w:rPr>
-            <w:rStyle w:val="Hyperlink"/>
+            <w:rStyle w:val="Collegamentoipertestuale"/>
             <w:noProof/>
           </w:rPr>
           <w:t>Scopo dell’applicazione</w:t>
@@ -647,7 +647,7 @@
     </w:p>
     <w:p>
       <w:pPr>
-        <w:pStyle w:val="TOC2"/>
+        <w:pStyle w:val="Sommario2"/>
         <w:tabs>
           <w:tab w:val="right" w:leader="dot" w:pos="9622"/>
         </w:tabs>
@@ -660,7 +660,7 @@
       <w:hyperlink w:anchor="_Toc41400378" w:history="1">
         <w:r>
           <w:rPr>
-            <w:rStyle w:val="Hyperlink"/>
+            <w:rStyle w:val="Collegamentoipertestuale"/>
             <w:noProof/>
           </w:rPr>
           <w:t>Destinatari dell’applicazione</w:t>
@@ -717,7 +717,7 @@
     </w:p>
     <w:p>
       <w:pPr>
-        <w:pStyle w:val="TOC2"/>
+        <w:pStyle w:val="Sommario2"/>
         <w:tabs>
           <w:tab w:val="right" w:leader="dot" w:pos="9622"/>
         </w:tabs>
@@ -730,7 +730,7 @@
       <w:hyperlink w:anchor="_Toc41400379" w:history="1">
         <w:r>
           <w:rPr>
-            <w:rStyle w:val="Hyperlink"/>
+            <w:rStyle w:val="Collegamentoipertestuale"/>
             <w:noProof/>
           </w:rPr>
           <w:t>I vincoli</w:t>
@@ -787,7 +787,7 @@
     </w:p>
     <w:p>
       <w:pPr>
-        <w:pStyle w:val="TOC2"/>
+        <w:pStyle w:val="Sommario2"/>
         <w:tabs>
           <w:tab w:val="right" w:leader="dot" w:pos="9622"/>
         </w:tabs>
@@ -800,7 +800,7 @@
       <w:hyperlink w:anchor="_Toc41400380" w:history="1">
         <w:r>
           <w:rPr>
-            <w:rStyle w:val="Hyperlink"/>
+            <w:rStyle w:val="Collegamentoipertestuale"/>
             <w:noProof/>
           </w:rPr>
           <w:t>Manuale di stile</w:t>
@@ -857,7 +857,7 @@
     </w:p>
     <w:p>
       <w:pPr>
-        <w:pStyle w:val="TOC2"/>
+        <w:pStyle w:val="Sommario2"/>
         <w:tabs>
           <w:tab w:val="right" w:leader="dot" w:pos="9622"/>
         </w:tabs>
@@ -870,7 +870,7 @@
       <w:hyperlink w:anchor="_Toc41400381" w:history="1">
         <w:r>
           <w:rPr>
-            <w:rStyle w:val="Hyperlink"/>
+            <w:rStyle w:val="Collegamentoipertestuale"/>
             <w:noProof/>
           </w:rPr>
           <w:t>Stimare i Costi</w:t>
@@ -927,7 +927,7 @@
     </w:p>
     <w:p>
       <w:pPr>
-        <w:pStyle w:val="TOC2"/>
+        <w:pStyle w:val="Sommario2"/>
         <w:tabs>
           <w:tab w:val="right" w:leader="dot" w:pos="9622"/>
         </w:tabs>
@@ -940,7 +940,7 @@
       <w:hyperlink w:anchor="_Toc41400382" w:history="1">
         <w:r>
           <w:rPr>
-            <w:rStyle w:val="Hyperlink"/>
+            <w:rStyle w:val="Collegamentoipertestuale"/>
             <w:noProof/>
           </w:rPr>
           <w:t>Monitoraggio progetto</w:t>
@@ -997,7 +997,7 @@
     </w:p>
     <w:p>
       <w:pPr>
-        <w:pStyle w:val="TOC2"/>
+        <w:pStyle w:val="Sommario2"/>
         <w:tabs>
           <w:tab w:val="right" w:leader="dot" w:pos="9622"/>
         </w:tabs>
@@ -1010,7 +1010,7 @@
       <w:hyperlink w:anchor="_Toc41400383" w:history="1">
         <w:r>
           <w:rPr>
-            <w:rStyle w:val="Hyperlink"/>
+            <w:rStyle w:val="Collegamentoipertestuale"/>
             <w:noProof/>
           </w:rPr>
           <w:t>Individuare e reperire le risorse</w:t>
@@ -1067,7 +1067,7 @@
     </w:p>
     <w:p>
       <w:pPr>
-        <w:pStyle w:val="TOC1"/>
+        <w:pStyle w:val="Sommario1"/>
         <w:tabs>
           <w:tab w:val="right" w:leader="dot" w:pos="9622"/>
         </w:tabs>
@@ -1080,7 +1080,7 @@
       <w:hyperlink w:anchor="_Toc41400384" w:history="1">
         <w:r>
           <w:rPr>
-            <w:rStyle w:val="Hyperlink"/>
+            <w:rStyle w:val="Collegamentoipertestuale"/>
             <w:noProof/>
           </w:rPr>
           <w:t>Progettazione</w:t>
@@ -1137,7 +1137,7 @@
     </w:p>
     <w:p>
       <w:pPr>
-        <w:pStyle w:val="TOC2"/>
+        <w:pStyle w:val="Sommario2"/>
         <w:tabs>
           <w:tab w:val="right" w:leader="dot" w:pos="9622"/>
         </w:tabs>
@@ -1150,7 +1150,7 @@
       <w:hyperlink w:anchor="_Toc41400385" w:history="1">
         <w:r>
           <w:rPr>
-            <w:rStyle w:val="Hyperlink"/>
+            <w:rStyle w:val="Collegamentoipertestuale"/>
             <w:noProof/>
           </w:rPr>
           <w:t>Definire i concetti da trasmettere attraverso il multimedia</w:t>
@@ -1207,7 +1207,7 @@
     </w:p>
     <w:p>
       <w:pPr>
-        <w:pStyle w:val="TOC2"/>
+        <w:pStyle w:val="Sommario2"/>
         <w:tabs>
           <w:tab w:val="right" w:leader="dot" w:pos="9622"/>
         </w:tabs>
@@ -1220,7 +1220,7 @@
       <w:hyperlink w:anchor="_Toc41400386" w:history="1">
         <w:r>
           <w:rPr>
-            <w:rStyle w:val="Hyperlink"/>
+            <w:rStyle w:val="Collegamentoipertestuale"/>
             <w:noProof/>
           </w:rPr>
           <w:t>Definire le competenze (task) da trasmettere attraverso il multimedia</w:t>
@@ -1277,7 +1277,7 @@
     </w:p>
     <w:p>
       <w:pPr>
-        <w:pStyle w:val="TOC2"/>
+        <w:pStyle w:val="Sommario2"/>
         <w:tabs>
           <w:tab w:val="right" w:leader="dot" w:pos="9622"/>
         </w:tabs>
@@ -1290,7 +1290,7 @@
       <w:hyperlink w:anchor="_Toc41400387" w:history="1">
         <w:r>
           <w:rPr>
-            <w:rStyle w:val="Hyperlink"/>
+            <w:rStyle w:val="Collegamentoipertestuale"/>
             <w:noProof/>
           </w:rPr>
           <w:t>Preparare una descrizione preliminare del programma</w:t>
@@ -1347,7 +1347,7 @@
     </w:p>
     <w:p>
       <w:pPr>
-        <w:pStyle w:val="TOC2"/>
+        <w:pStyle w:val="Sommario2"/>
         <w:tabs>
           <w:tab w:val="right" w:leader="dot" w:pos="9622"/>
         </w:tabs>
@@ -1360,7 +1360,7 @@
       <w:hyperlink w:anchor="_Toc41400388" w:history="1">
         <w:r>
           <w:rPr>
-            <w:rStyle w:val="Hyperlink"/>
+            <w:rStyle w:val="Collegamentoipertestuale"/>
             <w:noProof/>
           </w:rPr>
           <w:t>Dettagliare il progetto del multimedia</w:t>
@@ -1417,7 +1417,7 @@
     </w:p>
     <w:p>
       <w:pPr>
-        <w:pStyle w:val="TOC3"/>
+        <w:pStyle w:val="Sommario3"/>
         <w:tabs>
           <w:tab w:val="right" w:leader="dot" w:pos="9622"/>
         </w:tabs>
@@ -1430,7 +1430,7 @@
       <w:hyperlink w:anchor="_Toc41400389" w:history="1">
         <w:r>
           <w:rPr>
-            <w:rStyle w:val="Hyperlink"/>
+            <w:rStyle w:val="Collegamentoipertestuale"/>
             <w:noProof/>
           </w:rPr>
           <w:t>Prototipi</w:t>
@@ -1487,7 +1487,7 @@
     </w:p>
     <w:p>
       <w:pPr>
-        <w:pStyle w:val="TOC3"/>
+        <w:pStyle w:val="Sommario3"/>
         <w:tabs>
           <w:tab w:val="right" w:leader="dot" w:pos="9622"/>
         </w:tabs>
@@ -1500,7 +1500,7 @@
       <w:hyperlink w:anchor="_Toc41400390" w:history="1">
         <w:r>
           <w:rPr>
-            <w:rStyle w:val="Hyperlink"/>
+            <w:rStyle w:val="Collegamentoipertestuale"/>
             <w:noProof/>
           </w:rPr>
           <w:t>Flowchart</w:t>
@@ -1557,7 +1557,7 @@
     </w:p>
     <w:p>
       <w:pPr>
-        <w:pStyle w:val="TOC3"/>
+        <w:pStyle w:val="Sommario3"/>
         <w:tabs>
           <w:tab w:val="right" w:leader="dot" w:pos="9622"/>
         </w:tabs>
@@ -1570,7 +1570,7 @@
       <w:hyperlink w:anchor="_Toc41400391" w:history="1">
         <w:r>
           <w:rPr>
-            <w:rStyle w:val="Hyperlink"/>
+            <w:rStyle w:val="Collegamentoipertestuale"/>
             <w:noProof/>
           </w:rPr>
           <w:t>Storyboard</w:t>
@@ -1627,7 +1627,7 @@
     </w:p>
     <w:p>
       <w:pPr>
-        <w:pStyle w:val="TOC1"/>
+        <w:pStyle w:val="Sommario1"/>
         <w:tabs>
           <w:tab w:val="right" w:leader="dot" w:pos="9622"/>
         </w:tabs>
@@ -1640,7 +1640,7 @@
       <w:hyperlink w:anchor="_Toc41400392" w:history="1">
         <w:r>
           <w:rPr>
-            <w:rStyle w:val="Hyperlink"/>
+            <w:rStyle w:val="Collegamentoipertestuale"/>
             <w:noProof/>
           </w:rPr>
           <w:t>Test</w:t>
@@ -1697,7 +1697,7 @@
     </w:p>
     <w:p>
       <w:pPr>
-        <w:pStyle w:val="TOC2"/>
+        <w:pStyle w:val="Sommario2"/>
         <w:tabs>
           <w:tab w:val="right" w:leader="dot" w:pos="9622"/>
         </w:tabs>
@@ -1710,7 +1710,7 @@
       <w:hyperlink w:anchor="_Toc41400393" w:history="1">
         <w:r>
           <w:rPr>
-            <w:rStyle w:val="Hyperlink"/>
+            <w:rStyle w:val="Collegamentoipertestuale"/>
             <w:noProof/>
           </w:rPr>
           <w:t>Alpha test</w:t>
@@ -1767,7 +1767,7 @@
     </w:p>
     <w:p>
       <w:pPr>
-        <w:pStyle w:val="TOC3"/>
+        <w:pStyle w:val="Sommario3"/>
         <w:tabs>
           <w:tab w:val="right" w:leader="dot" w:pos="9622"/>
         </w:tabs>
@@ -1780,7 +1780,7 @@
       <w:hyperlink w:anchor="_Toc41400394" w:history="1">
         <w:r>
           <w:rPr>
-            <w:rStyle w:val="Hyperlink"/>
+            <w:rStyle w:val="Collegamentoipertestuale"/>
             <w:noProof/>
           </w:rPr>
           <w:t>Test funzionale</w:t>
@@ -1837,7 +1837,7 @@
     </w:p>
     <w:p>
       <w:pPr>
-        <w:pStyle w:val="TOC3"/>
+        <w:pStyle w:val="Sommario3"/>
         <w:tabs>
           <w:tab w:val="right" w:leader="dot" w:pos="9622"/>
         </w:tabs>
@@ -1850,7 +1850,7 @@
       <w:hyperlink w:anchor="_Toc41400395" w:history="1">
         <w:r>
           <w:rPr>
-            <w:rStyle w:val="Hyperlink"/>
+            <w:rStyle w:val="Collegamentoipertestuale"/>
             <w:noProof/>
           </w:rPr>
           <w:t>Test strutturale</w:t>
@@ -1907,7 +1907,7 @@
     </w:p>
     <w:p>
       <w:pPr>
-        <w:pStyle w:val="TOC2"/>
+        <w:pStyle w:val="Sommario2"/>
         <w:tabs>
           <w:tab w:val="right" w:leader="dot" w:pos="9622"/>
         </w:tabs>
@@ -1920,7 +1920,7 @@
       <w:hyperlink w:anchor="_Toc41400396" w:history="1">
         <w:r>
           <w:rPr>
-            <w:rStyle w:val="Hyperlink"/>
+            <w:rStyle w:val="Collegamentoipertestuale"/>
             <w:noProof/>
           </w:rPr>
           <w:t>Beta test</w:t>
@@ -1990,7 +1990,7 @@
     </w:p>
     <w:p>
       <w:pPr>
-        <w:pStyle w:val="Heading1"/>
+        <w:pStyle w:val="Titolo1"/>
       </w:pPr>
       <w:bookmarkStart w:id="1" w:name="_Toc41400376"/>
       <w:r>
@@ -2001,7 +2001,7 @@
     </w:p>
     <w:p>
       <w:pPr>
-        <w:pStyle w:val="Heading2"/>
+        <w:pStyle w:val="Titolo2"/>
       </w:pPr>
       <w:bookmarkStart w:id="2" w:name="_Toc41400377"/>
       <w:r>
@@ -2061,7 +2061,7 @@
     </w:p>
     <w:p>
       <w:pPr>
-        <w:pStyle w:val="ListParagraph"/>
+        <w:pStyle w:val="Paragrafoelenco"/>
         <w:numPr>
           <w:ilvl w:val="0"/>
           <w:numId w:val="20"/>
@@ -2080,7 +2080,7 @@
     </w:p>
     <w:p>
       <w:pPr>
-        <w:pStyle w:val="ListParagraph"/>
+        <w:pStyle w:val="Paragrafoelenco"/>
         <w:numPr>
           <w:ilvl w:val="0"/>
           <w:numId w:val="20"/>
@@ -2138,7 +2138,7 @@
     </w:p>
     <w:p>
       <w:pPr>
-        <w:pStyle w:val="ListParagraph"/>
+        <w:pStyle w:val="Paragrafoelenco"/>
         <w:numPr>
           <w:ilvl w:val="0"/>
           <w:numId w:val="2"/>
@@ -2170,7 +2170,7 @@
     </w:p>
     <w:p>
       <w:pPr>
-        <w:pStyle w:val="ListParagraph"/>
+        <w:pStyle w:val="Paragrafoelenco"/>
         <w:numPr>
           <w:ilvl w:val="0"/>
           <w:numId w:val="2"/>
@@ -2327,7 +2327,7 @@
     </w:p>
     <w:p>
       <w:pPr>
-        <w:pStyle w:val="ListParagraph"/>
+        <w:pStyle w:val="Paragrafoelenco"/>
         <w:numPr>
           <w:ilvl w:val="0"/>
           <w:numId w:val="2"/>
@@ -2400,7 +2400,7 @@
     </w:p>
     <w:p>
       <w:pPr>
-        <w:pStyle w:val="Heading2"/>
+        <w:pStyle w:val="Titolo2"/>
       </w:pPr>
       <w:bookmarkStart w:id="3" w:name="_Toc41400378"/>
       <w:r>
@@ -3369,7 +3369,7 @@
     </w:tbl>
     <w:p>
       <w:pPr>
-        <w:pStyle w:val="Heading2"/>
+        <w:pStyle w:val="Titolo2"/>
       </w:pPr>
       <w:bookmarkStart w:id="4" w:name="_Toc41400379"/>
       <w:r>
@@ -3542,7 +3542,7 @@
     </w:p>
     <w:p>
       <w:pPr>
-        <w:pStyle w:val="Heading2"/>
+        <w:pStyle w:val="Titolo2"/>
       </w:pPr>
       <w:bookmarkStart w:id="5" w:name="_Toc41400380"/>
       <w:r>
@@ -3684,7 +3684,7 @@
     </w:p>
     <w:p>
       <w:pPr>
-        <w:pStyle w:val="Heading2"/>
+        <w:pStyle w:val="Titolo2"/>
       </w:pPr>
       <w:bookmarkStart w:id="6" w:name="_Toc41400381"/>
       <w:r>
@@ -3873,7 +3873,7 @@
     </w:p>
     <w:p>
       <w:pPr>
-        <w:pStyle w:val="NormalWeb"/>
+        <w:pStyle w:val="NormaleWeb"/>
         <w:spacing w:before="0" w:beforeAutospacing="0"/>
         <w:rPr>
           <w:rFonts w:ascii="Avenir Book" w:hAnsi="Avenir Book" w:cs="Arial"/>
@@ -5801,7 +5801,7 @@
     </w:p>
     <w:p>
       <w:pPr>
-        <w:pStyle w:val="Heading2"/>
+        <w:pStyle w:val="Titolo2"/>
       </w:pPr>
       <w:bookmarkStart w:id="8" w:name="_Toc41400383"/>
       <w:r>
@@ -5938,7 +5938,7 @@
     </w:p>
     <w:p>
       <w:pPr>
-        <w:pStyle w:val="Heading1"/>
+        <w:pStyle w:val="Titolo1"/>
       </w:pPr>
       <w:bookmarkStart w:id="9" w:name="_Toc41400384"/>
       <w:r>
@@ -5949,7 +5949,7 @@
     </w:p>
     <w:p>
       <w:pPr>
-        <w:pStyle w:val="Heading2"/>
+        <w:pStyle w:val="Titolo2"/>
       </w:pPr>
       <w:r>
         <w:t>Introduzione</w:t>
@@ -5957,7 +5957,7 @@
     </w:p>
     <w:p>
       <w:pPr>
-        <w:pStyle w:val="NormalWeb"/>
+        <w:pStyle w:val="NormaleWeb"/>
         <w:rPr>
           <w:rFonts w:ascii="Avenir Book" w:hAnsi="Avenir Book"/>
         </w:rPr>
@@ -5971,14 +5971,14 @@
     </w:p>
     <w:p>
       <w:pPr>
-        <w:pStyle w:val="NormalWeb"/>
+        <w:pStyle w:val="NormaleWeb"/>
         <w:rPr>
           <w:rFonts w:ascii="Avenir Book" w:hAnsi="Avenir Book"/>
         </w:rPr>
       </w:pPr>
       <w:r>
         <w:rPr>
-          <w:rStyle w:val="Heading3Char"/>
+          <w:rStyle w:val="Titolo3Carattere"/>
         </w:rPr>
         <w:t>Presentazione dei concetti</w:t>
       </w:r>
@@ -5991,7 +5991,7 @@
     </w:p>
     <w:p>
       <w:pPr>
-        <w:pStyle w:val="NormalWeb"/>
+        <w:pStyle w:val="NormaleWeb"/>
         <w:rPr>
           <w:rFonts w:ascii="Avenir Book" w:hAnsi="Avenir Book"/>
         </w:rPr>
@@ -6005,7 +6005,7 @@
     </w:p>
     <w:p>
       <w:pPr>
-        <w:pStyle w:val="NormalWeb"/>
+        <w:pStyle w:val="NormaleWeb"/>
         <w:numPr>
           <w:ilvl w:val="0"/>
           <w:numId w:val="12"/>
@@ -6031,7 +6031,7 @@
     </w:p>
     <w:p>
       <w:pPr>
-        <w:pStyle w:val="NormalWeb"/>
+        <w:pStyle w:val="NormaleWeb"/>
         <w:numPr>
           <w:ilvl w:val="0"/>
           <w:numId w:val="12"/>
@@ -6057,14 +6057,14 @@
     </w:p>
     <w:p>
       <w:pPr>
-        <w:pStyle w:val="NormalWeb"/>
+        <w:pStyle w:val="NormaleWeb"/>
         <w:rPr>
           <w:rFonts w:ascii="Avenir Book" w:hAnsi="Avenir Book"/>
         </w:rPr>
       </w:pPr>
       <w:r>
         <w:rPr>
-          <w:rStyle w:val="Heading3Char"/>
+          <w:rStyle w:val="Titolo3Carattere"/>
         </w:rPr>
         <w:t>Definizione dei concetti</w:t>
       </w:r>
@@ -6077,7 +6077,7 @@
     </w:p>
     <w:p>
       <w:pPr>
-        <w:pStyle w:val="NormalWeb"/>
+        <w:pStyle w:val="NormaleWeb"/>
         <w:rPr>
           <w:rFonts w:ascii="Avenir Book" w:hAnsi="Avenir Book"/>
         </w:rPr>
@@ -6091,7 +6091,7 @@
     </w:p>
     <w:p>
       <w:pPr>
-        <w:pStyle w:val="NormalWeb"/>
+        <w:pStyle w:val="NormaleWeb"/>
         <w:numPr>
           <w:ilvl w:val="0"/>
           <w:numId w:val="13"/>
@@ -6117,7 +6117,7 @@
     </w:p>
     <w:p>
       <w:pPr>
-        <w:pStyle w:val="NormalWeb"/>
+        <w:pStyle w:val="NormaleWeb"/>
         <w:numPr>
           <w:ilvl w:val="0"/>
           <w:numId w:val="13"/>
@@ -6143,7 +6143,7 @@
     </w:p>
     <w:p>
       <w:pPr>
-        <w:pStyle w:val="NormalWeb"/>
+        <w:pStyle w:val="NormaleWeb"/>
         <w:numPr>
           <w:ilvl w:val="0"/>
           <w:numId w:val="13"/>
@@ -6169,7 +6169,7 @@
     </w:p>
     <w:p>
       <w:pPr>
-        <w:pStyle w:val="NormalWeb"/>
+        <w:pStyle w:val="NormaleWeb"/>
         <w:rPr>
           <w:rFonts w:ascii="Avenir Book" w:hAnsi="Avenir Book"/>
         </w:rPr>
@@ -6192,7 +6192,7 @@
     </w:p>
     <w:p>
       <w:pPr>
-        <w:pStyle w:val="Heading2"/>
+        <w:pStyle w:val="Titolo2"/>
       </w:pPr>
       <w:bookmarkStart w:id="10" w:name="_Toc41400386"/>
       <w:r>
@@ -6203,7 +6203,7 @@
     </w:p>
     <w:p>
       <w:pPr>
-        <w:pStyle w:val="NormalWeb"/>
+        <w:pStyle w:val="NormaleWeb"/>
         <w:rPr>
           <w:rFonts w:ascii="Avenir Book" w:hAnsi="Avenir Book"/>
         </w:rPr>
@@ -6231,7 +6231,7 @@
     </w:p>
     <w:p>
       <w:pPr>
-        <w:pStyle w:val="NormalWeb"/>
+        <w:pStyle w:val="NormaleWeb"/>
         <w:rPr>
           <w:rFonts w:ascii="Avenir Book" w:hAnsi="Avenir Book"/>
         </w:rPr>
@@ -6281,7 +6281,7 @@
     </w:p>
     <w:p>
       <w:pPr>
-        <w:pStyle w:val="NormalWeb"/>
+        <w:pStyle w:val="NormaleWeb"/>
         <w:rPr>
           <w:rFonts w:ascii="Avenir Book" w:hAnsi="Avenir Book"/>
         </w:rPr>
@@ -6297,7 +6297,7 @@
     </w:p>
     <w:p>
       <w:pPr>
-        <w:pStyle w:val="NormalWeb"/>
+        <w:pStyle w:val="NormaleWeb"/>
         <w:numPr>
           <w:ilvl w:val="0"/>
           <w:numId w:val="4"/>
@@ -6323,7 +6323,7 @@
     </w:p>
     <w:p>
       <w:pPr>
-        <w:pStyle w:val="NormalWeb"/>
+        <w:pStyle w:val="NormaleWeb"/>
         <w:rPr>
           <w:rFonts w:ascii="Avenir Book" w:hAnsi="Avenir Book"/>
         </w:rPr>
@@ -6339,7 +6339,7 @@
     </w:p>
     <w:p>
       <w:pPr>
-        <w:pStyle w:val="NormalWeb"/>
+        <w:pStyle w:val="NormaleWeb"/>
         <w:numPr>
           <w:ilvl w:val="0"/>
           <w:numId w:val="5"/>
@@ -6373,7 +6373,7 @@
     </w:p>
     <w:p>
       <w:pPr>
-        <w:pStyle w:val="NormalWeb"/>
+        <w:pStyle w:val="NormaleWeb"/>
         <w:rPr>
           <w:rFonts w:ascii="Avenir Book" w:hAnsi="Avenir Book"/>
         </w:rPr>
@@ -6389,7 +6389,7 @@
     </w:p>
     <w:p>
       <w:pPr>
-        <w:pStyle w:val="NormalWeb"/>
+        <w:pStyle w:val="NormaleWeb"/>
         <w:numPr>
           <w:ilvl w:val="0"/>
           <w:numId w:val="6"/>
@@ -6415,7 +6415,7 @@
     </w:p>
     <w:p>
       <w:pPr>
-        <w:pStyle w:val="NormalWeb"/>
+        <w:pStyle w:val="NormaleWeb"/>
         <w:rPr>
           <w:rFonts w:ascii="Avenir Book" w:hAnsi="Avenir Book"/>
         </w:rPr>
@@ -6431,7 +6431,7 @@
     </w:p>
     <w:p>
       <w:pPr>
-        <w:pStyle w:val="NormalWeb"/>
+        <w:pStyle w:val="NormaleWeb"/>
         <w:numPr>
           <w:ilvl w:val="0"/>
           <w:numId w:val="7"/>
@@ -6478,7 +6478,7 @@
     </w:p>
     <w:p>
       <w:pPr>
-        <w:pStyle w:val="Heading2"/>
+        <w:pStyle w:val="Titolo2"/>
       </w:pPr>
       <w:bookmarkStart w:id="11" w:name="_Toc41400387"/>
       <w:r>
@@ -6663,7 +6663,7 @@
     <w:p>
       <w:r>
         <w:rPr>
-          <w:rStyle w:val="Heading4Char"/>
+          <w:rStyle w:val="Titolo4Carattere"/>
         </w:rPr>
         <w:t>Dinamiche di Gameplay e Navigazione</w:t>
       </w:r>
@@ -6710,7 +6710,7 @@
     <w:p>
       <w:r>
         <w:rPr>
-          <w:rStyle w:val="Heading4Char"/>
+          <w:rStyle w:val="Titolo4Carattere"/>
         </w:rPr>
         <w:t>Interazione e Comandi</w:t>
       </w:r>
@@ -6769,7 +6769,7 @@
     <w:p/>
     <w:p>
       <w:pPr>
-        <w:pStyle w:val="Heading3"/>
+        <w:pStyle w:val="Titolo3"/>
       </w:pPr>
       <w:r>
         <w:t>Esempi di Missioni e Minigiochi</w:t>
@@ -6807,7 +6807,7 @@
     </w:p>
     <w:p>
       <w:pPr>
-        <w:pStyle w:val="Heading4"/>
+        <w:pStyle w:val="Titolo4"/>
       </w:pPr>
       <w:r>
         <w:t>Pattern A: Esplorazione e Raccolta (Nodi Godot: Area2D + Timer/Contatore)</w:t>
@@ -7009,7 +7009,7 @@
     </w:p>
     <w:p>
       <w:pPr>
-        <w:pStyle w:val="Heading4"/>
+        <w:pStyle w:val="Titolo4"/>
       </w:pPr>
       <w:r>
         <w:t>Pattern B: Tempismo e Riflessi (Nodi Godot: Area2D overlap + Input Event)</w:t>
@@ -7264,7 +7264,7 @@
     </w:p>
     <w:p>
       <w:pPr>
-        <w:pStyle w:val="Heading2"/>
+        <w:pStyle w:val="Titolo2"/>
       </w:pPr>
       <w:bookmarkStart w:id="12" w:name="_Toc41400388"/>
       <w:r>
@@ -7274,76 +7274,631 @@
       <w:bookmarkEnd w:id="12"/>
     </w:p>
     <w:p>
-      <w:r>
-        <w:t>Definire i dettagli dell’applicazione mediante la creazione di documenti di design.</w:t>
-      </w:r>
-    </w:p>
-    <w:p>
-      <w:pPr>
-        <w:pStyle w:val="Heading3"/>
+      <w:pPr>
+        <w:pStyle w:val="Titolo3"/>
+      </w:pPr>
+      <w:bookmarkStart w:id="13" w:name="_Toc41400389"/>
+      <w:r>
+        <w:t>Prototipi</w:t>
+      </w:r>
+      <w:bookmarkEnd w:id="13"/>
+    </w:p>
+    <w:p>
+      <w:pPr>
+        <w:pStyle w:val="Paragrafoelenco"/>
+        <w:numPr>
+          <w:ilvl w:val="0"/>
+          <w:numId w:val="27"/>
+        </w:numPr>
+      </w:pPr>
+      <w:proofErr w:type="spellStart"/>
+      <w:r>
+        <w:t>Menù</w:t>
+      </w:r>
+      <w:proofErr w:type="spellEnd"/>
+      <w:r>
+        <w:t xml:space="preserve"> Principale:</w:t>
+      </w:r>
+    </w:p>
+    <w:p>
+      <w:pPr>
+        <w:jc w:val="center"/>
+      </w:pPr>
+      <w:r>
+        <w:rPr>
+          <w:noProof/>
+        </w:rPr>
+        <w:drawing>
+          <wp:inline distT="0" distB="0" distL="0" distR="0" wp14:anchorId="5713B4DB" wp14:editId="7C2BE2C9">
+            <wp:extent cx="4343432" cy="3867178"/>
+            <wp:effectExtent l="0" t="0" r="0" b="0"/>
+            <wp:docPr id="1004013622" name="Immagine 3"/>
+            <wp:cNvGraphicFramePr>
+              <a:graphicFrameLocks xmlns:a="http://schemas.openxmlformats.org/drawingml/2006/main" noChangeAspect="1"/>
+            </wp:cNvGraphicFramePr>
+            <a:graphic xmlns:a="http://schemas.openxmlformats.org/drawingml/2006/main">
+              <a:graphicData uri="http://schemas.openxmlformats.org/drawingml/2006/picture">
+                <pic:pic xmlns:pic="http://schemas.openxmlformats.org/drawingml/2006/picture">
+                  <pic:nvPicPr>
+                    <pic:cNvPr id="1004013622" name="Immagine 1004013622"/>
+                    <pic:cNvPicPr/>
+                  </pic:nvPicPr>
+                  <pic:blipFill>
+                    <a:blip r:embed="rId10">
+                      <a:extLst>
+                        <a:ext uri="{28A0092B-C50C-407E-A947-70E740481C1C}">
+                          <a14:useLocalDpi xmlns:a14="http://schemas.microsoft.com/office/drawing/2010/main" val="0"/>
+                        </a:ext>
+                      </a:extLst>
+                    </a:blip>
+                    <a:stretch>
+                      <a:fillRect/>
+                    </a:stretch>
+                  </pic:blipFill>
+                  <pic:spPr>
+                    <a:xfrm>
+                      <a:off x="0" y="0"/>
+                      <a:ext cx="4343432" cy="3867178"/>
+                    </a:xfrm>
+                    <a:prstGeom prst="rect">
+                      <a:avLst/>
+                    </a:prstGeom>
+                  </pic:spPr>
+                </pic:pic>
+              </a:graphicData>
+            </a:graphic>
+          </wp:inline>
+        </w:drawing>
+      </w:r>
+    </w:p>
+    <w:p>
+      <w:r>
+        <w:br w:type="page"/>
+      </w:r>
+    </w:p>
+    <w:p>
+      <w:pPr>
+        <w:pStyle w:val="Paragrafoelenco"/>
+        <w:numPr>
+          <w:ilvl w:val="0"/>
+          <w:numId w:val="27"/>
+        </w:numPr>
+      </w:pPr>
+      <w:r>
+        <w:lastRenderedPageBreak/>
+        <w:t>Gameplay nella città:</w:t>
+      </w:r>
+    </w:p>
+    <w:p>
+      <w:pPr>
+        <w:jc w:val="center"/>
+      </w:pPr>
+      <w:r>
+        <w:rPr>
+          <w:noProof/>
+        </w:rPr>
+        <w:drawing>
+          <wp:inline distT="0" distB="0" distL="0" distR="0" wp14:anchorId="5491DC60" wp14:editId="39A75D7D">
+            <wp:extent cx="4343432" cy="3867178"/>
+            <wp:effectExtent l="0" t="0" r="0" b="0"/>
+            <wp:docPr id="339149204" name="Immagine 4"/>
+            <wp:cNvGraphicFramePr>
+              <a:graphicFrameLocks xmlns:a="http://schemas.openxmlformats.org/drawingml/2006/main" noChangeAspect="1"/>
+            </wp:cNvGraphicFramePr>
+            <a:graphic xmlns:a="http://schemas.openxmlformats.org/drawingml/2006/main">
+              <a:graphicData uri="http://schemas.openxmlformats.org/drawingml/2006/picture">
+                <pic:pic xmlns:pic="http://schemas.openxmlformats.org/drawingml/2006/picture">
+                  <pic:nvPicPr>
+                    <pic:cNvPr id="339149204" name="Immagine 339149204"/>
+                    <pic:cNvPicPr/>
+                  </pic:nvPicPr>
+                  <pic:blipFill>
+                    <a:blip r:embed="rId11">
+                      <a:extLst>
+                        <a:ext uri="{28A0092B-C50C-407E-A947-70E740481C1C}">
+                          <a14:useLocalDpi xmlns:a14="http://schemas.microsoft.com/office/drawing/2010/main" val="0"/>
+                        </a:ext>
+                      </a:extLst>
+                    </a:blip>
+                    <a:stretch>
+                      <a:fillRect/>
+                    </a:stretch>
+                  </pic:blipFill>
+                  <pic:spPr>
+                    <a:xfrm>
+                      <a:off x="0" y="0"/>
+                      <a:ext cx="4343432" cy="3867178"/>
+                    </a:xfrm>
+                    <a:prstGeom prst="rect">
+                      <a:avLst/>
+                    </a:prstGeom>
+                  </pic:spPr>
+                </pic:pic>
+              </a:graphicData>
+            </a:graphic>
+          </wp:inline>
+        </w:drawing>
+      </w:r>
+    </w:p>
+    <w:p>
+      <w:pPr>
+        <w:pStyle w:val="Paragrafoelenco"/>
+        <w:numPr>
+          <w:ilvl w:val="0"/>
+          <w:numId w:val="27"/>
+        </w:numPr>
+      </w:pPr>
+      <w:r>
+        <w:t>Dialogo NPC:</w:t>
+      </w:r>
+    </w:p>
+    <w:p>
+      <w:pPr>
+        <w:jc w:val="center"/>
+      </w:pPr>
+      <w:r>
+        <w:rPr>
+          <w:noProof/>
+        </w:rPr>
+        <w:drawing>
+          <wp:inline distT="0" distB="0" distL="0" distR="0" wp14:anchorId="5A4BEA6C" wp14:editId="4C1220C8">
+            <wp:extent cx="4343432" cy="3867178"/>
+            <wp:effectExtent l="0" t="0" r="0" b="0"/>
+            <wp:docPr id="633642010" name="Immagine 5"/>
+            <wp:cNvGraphicFramePr>
+              <a:graphicFrameLocks xmlns:a="http://schemas.openxmlformats.org/drawingml/2006/main" noChangeAspect="1"/>
+            </wp:cNvGraphicFramePr>
+            <a:graphic xmlns:a="http://schemas.openxmlformats.org/drawingml/2006/main">
+              <a:graphicData uri="http://schemas.openxmlformats.org/drawingml/2006/picture">
+                <pic:pic xmlns:pic="http://schemas.openxmlformats.org/drawingml/2006/picture">
+                  <pic:nvPicPr>
+                    <pic:cNvPr id="633642010" name="Immagine 633642010"/>
+                    <pic:cNvPicPr/>
+                  </pic:nvPicPr>
+                  <pic:blipFill>
+                    <a:blip r:embed="rId12">
+                      <a:extLst>
+                        <a:ext uri="{28A0092B-C50C-407E-A947-70E740481C1C}">
+                          <a14:useLocalDpi xmlns:a14="http://schemas.microsoft.com/office/drawing/2010/main" val="0"/>
+                        </a:ext>
+                      </a:extLst>
+                    </a:blip>
+                    <a:stretch>
+                      <a:fillRect/>
+                    </a:stretch>
+                  </pic:blipFill>
+                  <pic:spPr>
+                    <a:xfrm>
+                      <a:off x="0" y="0"/>
+                      <a:ext cx="4343432" cy="3867178"/>
+                    </a:xfrm>
+                    <a:prstGeom prst="rect">
+                      <a:avLst/>
+                    </a:prstGeom>
+                  </pic:spPr>
+                </pic:pic>
+              </a:graphicData>
+            </a:graphic>
+          </wp:inline>
+        </w:drawing>
+      </w:r>
+    </w:p>
+    <w:p>
+      <w:r>
+        <w:br w:type="page"/>
+      </w:r>
+    </w:p>
+    <w:p>
+      <w:pPr>
+        <w:pStyle w:val="Paragrafoelenco"/>
+        <w:numPr>
+          <w:ilvl w:val="0"/>
+          <w:numId w:val="27"/>
+        </w:numPr>
+      </w:pPr>
+      <w:r>
+        <w:lastRenderedPageBreak/>
+        <w:t>Livello Petruzzelli:</w:t>
+      </w:r>
+    </w:p>
+    <w:p>
+      <w:pPr>
+        <w:jc w:val="center"/>
+      </w:pPr>
+      <w:r>
+        <w:rPr>
+          <w:noProof/>
+        </w:rPr>
+        <w:drawing>
+          <wp:inline distT="0" distB="0" distL="0" distR="0" wp14:anchorId="42DBA137" wp14:editId="54F8C032">
+            <wp:extent cx="4533933" cy="3867178"/>
+            <wp:effectExtent l="0" t="0" r="0" b="0"/>
+            <wp:docPr id="1029590271" name="Immagine 6"/>
+            <wp:cNvGraphicFramePr>
+              <a:graphicFrameLocks xmlns:a="http://schemas.openxmlformats.org/drawingml/2006/main" noChangeAspect="1"/>
+            </wp:cNvGraphicFramePr>
+            <a:graphic xmlns:a="http://schemas.openxmlformats.org/drawingml/2006/main">
+              <a:graphicData uri="http://schemas.openxmlformats.org/drawingml/2006/picture">
+                <pic:pic xmlns:pic="http://schemas.openxmlformats.org/drawingml/2006/picture">
+                  <pic:nvPicPr>
+                    <pic:cNvPr id="1029590271" name="Immagine 1029590271"/>
+                    <pic:cNvPicPr/>
+                  </pic:nvPicPr>
+                  <pic:blipFill>
+                    <a:blip r:embed="rId13">
+                      <a:extLst>
+                        <a:ext uri="{28A0092B-C50C-407E-A947-70E740481C1C}">
+                          <a14:useLocalDpi xmlns:a14="http://schemas.microsoft.com/office/drawing/2010/main" val="0"/>
+                        </a:ext>
+                      </a:extLst>
+                    </a:blip>
+                    <a:stretch>
+                      <a:fillRect/>
+                    </a:stretch>
+                  </pic:blipFill>
+                  <pic:spPr>
+                    <a:xfrm>
+                      <a:off x="0" y="0"/>
+                      <a:ext cx="4533933" cy="3867178"/>
+                    </a:xfrm>
+                    <a:prstGeom prst="rect">
+                      <a:avLst/>
+                    </a:prstGeom>
+                  </pic:spPr>
+                </pic:pic>
+              </a:graphicData>
+            </a:graphic>
+          </wp:inline>
+        </w:drawing>
+      </w:r>
+    </w:p>
+    <w:p>
+      <w:pPr>
+        <w:pStyle w:val="Paragrafoelenco"/>
+        <w:numPr>
+          <w:ilvl w:val="0"/>
+          <w:numId w:val="27"/>
+        </w:numPr>
+      </w:pPr>
+      <w:r>
+        <w:t>Taccuino scoperte:</w:t>
+      </w:r>
+    </w:p>
+    <w:p>
+      <w:pPr>
+        <w:jc w:val="center"/>
+      </w:pPr>
+      <w:r>
+        <w:rPr>
+          <w:noProof/>
+        </w:rPr>
+        <w:drawing>
+          <wp:inline distT="0" distB="0" distL="0" distR="0" wp14:anchorId="702D54DE" wp14:editId="0AE69C0A">
+            <wp:extent cx="4343432" cy="3867178"/>
+            <wp:effectExtent l="0" t="0" r="0" b="0"/>
+            <wp:docPr id="1517050417" name="Immagine 7"/>
+            <wp:cNvGraphicFramePr>
+              <a:graphicFrameLocks xmlns:a="http://schemas.openxmlformats.org/drawingml/2006/main" noChangeAspect="1"/>
+            </wp:cNvGraphicFramePr>
+            <a:graphic xmlns:a="http://schemas.openxmlformats.org/drawingml/2006/main">
+              <a:graphicData uri="http://schemas.openxmlformats.org/drawingml/2006/picture">
+                <pic:pic xmlns:pic="http://schemas.openxmlformats.org/drawingml/2006/picture">
+                  <pic:nvPicPr>
+                    <pic:cNvPr id="1517050417" name="Immagine 1517050417"/>
+                    <pic:cNvPicPr/>
+                  </pic:nvPicPr>
+                  <pic:blipFill>
+                    <a:blip r:embed="rId14">
+                      <a:extLst>
+                        <a:ext uri="{28A0092B-C50C-407E-A947-70E740481C1C}">
+                          <a14:useLocalDpi xmlns:a14="http://schemas.microsoft.com/office/drawing/2010/main" val="0"/>
+                        </a:ext>
+                      </a:extLst>
+                    </a:blip>
+                    <a:stretch>
+                      <a:fillRect/>
+                    </a:stretch>
+                  </pic:blipFill>
+                  <pic:spPr>
+                    <a:xfrm>
+                      <a:off x="0" y="0"/>
+                      <a:ext cx="4343432" cy="3867178"/>
+                    </a:xfrm>
+                    <a:prstGeom prst="rect">
+                      <a:avLst/>
+                    </a:prstGeom>
+                  </pic:spPr>
+                </pic:pic>
+              </a:graphicData>
+            </a:graphic>
+          </wp:inline>
+        </w:drawing>
+      </w:r>
+    </w:p>
+    <w:p>
+      <w:pPr>
+        <w:pStyle w:val="Titolo3"/>
         <w:rPr>
           <w:lang w:val="en-US"/>
         </w:rPr>
       </w:pPr>
-      <w:bookmarkStart w:id="13" w:name="_Toc41400389"/>
+      <w:bookmarkStart w:id="14" w:name="_Toc41400390"/>
+      <w:r>
+        <w:rPr>
+          <w:lang w:val="en-US"/>
+        </w:rPr>
+        <w:lastRenderedPageBreak/>
+        <w:t>Flowchart</w:t>
+      </w:r>
+      <w:bookmarkEnd w:id="14"/>
+    </w:p>
+    <w:p>
+      <w:pPr>
+        <w:pStyle w:val="Paragrafoelenco"/>
+        <w:numPr>
+          <w:ilvl w:val="0"/>
+          <w:numId w:val="27"/>
+        </w:numPr>
+      </w:pPr>
+      <w:r>
+        <w:t xml:space="preserve">Flowchart di </w:t>
+      </w:r>
+      <w:proofErr w:type="gramStart"/>
+      <w:r>
+        <w:t>1°</w:t>
+      </w:r>
+      <w:proofErr w:type="gramEnd"/>
+      <w:r>
+        <w:t xml:space="preserve"> livello</w:t>
+      </w:r>
+      <w:r>
+        <w:t>,</w:t>
+      </w:r>
+      <w:r>
+        <w:t xml:space="preserve"> </w:t>
+      </w:r>
       <w:proofErr w:type="spellStart"/>
       <w:r>
         <w:rPr>
+          <w:b/>
+          <w:bCs/>
+        </w:rPr>
+        <w:t>O</w:t>
+      </w:r>
+      <w:r>
+        <w:rPr>
+          <w:b/>
+          <w:bCs/>
+        </w:rPr>
+        <w:t>verview</w:t>
+      </w:r>
+      <w:proofErr w:type="spellEnd"/>
+      <w:r>
+        <w:rPr>
+          <w:b/>
+          <w:bCs/>
+        </w:rPr>
+        <w:t xml:space="preserve"> del </w:t>
+      </w:r>
+      <w:r>
+        <w:rPr>
+          <w:b/>
+          <w:bCs/>
+        </w:rPr>
+        <w:t>G</w:t>
+      </w:r>
+      <w:r>
+        <w:rPr>
+          <w:b/>
+          <w:bCs/>
+        </w:rPr>
+        <w:t>ioco</w:t>
+      </w:r>
+      <w:r>
+        <w:t>:</w:t>
+      </w:r>
+      <w:r>
+        <w:br/>
+      </w:r>
+    </w:p>
+    <w:p>
+      <w:r>
+        <w:rPr>
+          <w:noProof/>
+        </w:rPr>
+        <w:drawing>
+          <wp:inline distT="0" distB="0" distL="0" distR="0" wp14:anchorId="7678BF2C" wp14:editId="2EDE4609">
+            <wp:extent cx="6116320" cy="6522810"/>
+            <wp:effectExtent l="0" t="0" r="0" b="0"/>
+            <wp:docPr id="788856210" name="Immagine 8"/>
+            <wp:cNvGraphicFramePr>
+              <a:graphicFrameLocks xmlns:a="http://schemas.openxmlformats.org/drawingml/2006/main" noChangeAspect="1"/>
+            </wp:cNvGraphicFramePr>
+            <a:graphic xmlns:a="http://schemas.openxmlformats.org/drawingml/2006/main">
+              <a:graphicData uri="http://schemas.openxmlformats.org/drawingml/2006/picture">
+                <pic:pic xmlns:pic="http://schemas.openxmlformats.org/drawingml/2006/picture">
+                  <pic:nvPicPr>
+                    <pic:cNvPr id="788856210" name="Immagine 788856210"/>
+                    <pic:cNvPicPr/>
+                  </pic:nvPicPr>
+                  <pic:blipFill rotWithShape="1">
+                    <a:blip r:embed="rId15">
+                      <a:extLst>
+                        <a:ext uri="{28A0092B-C50C-407E-A947-70E740481C1C}">
+                          <a14:useLocalDpi xmlns:a14="http://schemas.microsoft.com/office/drawing/2010/main" val="0"/>
+                        </a:ext>
+                      </a:extLst>
+                    </a:blip>
+                    <a:srcRect t="5369"/>
+                    <a:stretch>
+                      <a:fillRect/>
+                    </a:stretch>
+                  </pic:blipFill>
+                  <pic:spPr bwMode="auto">
+                    <a:xfrm>
+                      <a:off x="0" y="0"/>
+                      <a:ext cx="6116320" cy="6522810"/>
+                    </a:xfrm>
+                    <a:prstGeom prst="rect">
+                      <a:avLst/>
+                    </a:prstGeom>
+                    <a:ln>
+                      <a:noFill/>
+                    </a:ln>
+                    <a:extLst>
+                      <a:ext uri="{53640926-AAD7-44D8-BBD7-CCE9431645EC}">
+                        <a14:shadowObscured xmlns:a14="http://schemas.microsoft.com/office/drawing/2010/main"/>
+                      </a:ext>
+                    </a:extLst>
+                  </pic:spPr>
+                </pic:pic>
+              </a:graphicData>
+            </a:graphic>
+          </wp:inline>
+        </w:drawing>
+      </w:r>
+    </w:p>
+    <w:p>
+      <w:r>
+        <w:br w:type="page"/>
+      </w:r>
+    </w:p>
+    <w:p>
+      <w:pPr>
+        <w:pStyle w:val="Paragrafoelenco"/>
+        <w:numPr>
+          <w:ilvl w:val="0"/>
+          <w:numId w:val="27"/>
+        </w:numPr>
+      </w:pPr>
+      <w:r>
+        <w:lastRenderedPageBreak/>
+        <w:t xml:space="preserve">Flowchart di </w:t>
+      </w:r>
+      <w:proofErr w:type="gramStart"/>
+      <w:r>
+        <w:t>2</w:t>
+      </w:r>
+      <w:r>
+        <w:t>°</w:t>
+      </w:r>
+      <w:proofErr w:type="gramEnd"/>
+      <w:r>
+        <w:t xml:space="preserve"> livello</w:t>
+      </w:r>
+      <w:r>
+        <w:t>,</w:t>
+      </w:r>
+      <w:r>
+        <w:t xml:space="preserve"> </w:t>
+      </w:r>
+      <w:r>
+        <w:rPr>
+          <w:b/>
+          <w:bCs/>
+        </w:rPr>
+        <w:t>Logica Minigioco Petruzzelli</w:t>
+      </w:r>
+      <w:r>
+        <w:t>:</w:t>
+      </w:r>
+      <w:r>
+        <w:br/>
+      </w:r>
+    </w:p>
+    <w:p>
+      <w:pPr>
+        <w:jc w:val="center"/>
+      </w:pPr>
+      <w:r>
+        <w:rPr>
+          <w:noProof/>
+        </w:rPr>
+        <w:drawing>
+          <wp:inline distT="0" distB="0" distL="0" distR="0" wp14:anchorId="2D69741C" wp14:editId="2151BEB6">
+            <wp:extent cx="6116320" cy="7671526"/>
+            <wp:effectExtent l="0" t="0" r="0" b="0"/>
+            <wp:docPr id="1471364459" name="Immagine 9"/>
+            <wp:cNvGraphicFramePr>
+              <a:graphicFrameLocks xmlns:a="http://schemas.openxmlformats.org/drawingml/2006/main" noChangeAspect="1"/>
+            </wp:cNvGraphicFramePr>
+            <a:graphic xmlns:a="http://schemas.openxmlformats.org/drawingml/2006/main">
+              <a:graphicData uri="http://schemas.openxmlformats.org/drawingml/2006/picture">
+                <pic:pic xmlns:pic="http://schemas.openxmlformats.org/drawingml/2006/picture">
+                  <pic:nvPicPr>
+                    <pic:cNvPr id="1471364459" name="Immagine 1471364459"/>
+                    <pic:cNvPicPr/>
+                  </pic:nvPicPr>
+                  <pic:blipFill rotWithShape="1">
+                    <a:blip r:embed="rId16" cstate="print">
+                      <a:extLst>
+                        <a:ext uri="{28A0092B-C50C-407E-A947-70E740481C1C}">
+                          <a14:useLocalDpi xmlns:a14="http://schemas.microsoft.com/office/drawing/2010/main" val="0"/>
+                        </a:ext>
+                      </a:extLst>
+                    </a:blip>
+                    <a:srcRect t="3690"/>
+                    <a:stretch>
+                      <a:fillRect/>
+                    </a:stretch>
+                  </pic:blipFill>
+                  <pic:spPr bwMode="auto">
+                    <a:xfrm>
+                      <a:off x="0" y="0"/>
+                      <a:ext cx="6116320" cy="7671526"/>
+                    </a:xfrm>
+                    <a:prstGeom prst="rect">
+                      <a:avLst/>
+                    </a:prstGeom>
+                    <a:ln>
+                      <a:noFill/>
+                    </a:ln>
+                    <a:extLst>
+                      <a:ext uri="{53640926-AAD7-44D8-BBD7-CCE9431645EC}">
+                        <a14:shadowObscured xmlns:a14="http://schemas.microsoft.com/office/drawing/2010/main"/>
+                      </a:ext>
+                    </a:extLst>
+                  </pic:spPr>
+                </pic:pic>
+              </a:graphicData>
+            </a:graphic>
+          </wp:inline>
+        </w:drawing>
+      </w:r>
+    </w:p>
+    <w:p>
+      <w:pPr>
+        <w:pStyle w:val="Titolo3"/>
+        <w:rPr>
           <w:lang w:val="en-US"/>
         </w:rPr>
-        <w:t>Prototipi</w:t>
-      </w:r>
-      <w:bookmarkEnd w:id="13"/>
-      <w:proofErr w:type="spellEnd"/>
-    </w:p>
-    <w:p>
-      <w:pPr>
-        <w:pStyle w:val="Heading3"/>
+      </w:pPr>
+      <w:bookmarkStart w:id="15" w:name="_Toc41400391"/>
+      <w:r>
         <w:rPr>
           <w:lang w:val="en-US"/>
         </w:rPr>
-      </w:pPr>
-      <w:bookmarkStart w:id="14" w:name="_Toc41400390"/>
-      <w:r>
+        <w:lastRenderedPageBreak/>
+        <w:t>Storyboard</w:t>
+      </w:r>
+      <w:bookmarkEnd w:id="15"/>
+    </w:p>
+    <w:p>
+      <w:pPr>
         <w:rPr>
           <w:lang w:val="en-US"/>
         </w:rPr>
-        <w:t>Flowchart</w:t>
-      </w:r>
-      <w:bookmarkEnd w:id="14"/>
-    </w:p>
-    <w:p>
-      <w:pPr>
-        <w:pStyle w:val="Heading3"/>
+      </w:pPr>
+      <w:r>
         <w:rPr>
           <w:lang w:val="en-US"/>
         </w:rPr>
-      </w:pPr>
-      <w:bookmarkStart w:id="15" w:name="_Toc41400391"/>
-      <w:r>
-        <w:rPr>
-          <w:lang w:val="en-US"/>
-        </w:rPr>
-        <w:t>Storyboard</w:t>
-      </w:r>
-      <w:bookmarkEnd w:id="15"/>
-    </w:p>
-    <w:p>
-      <w:pPr>
-        <w:rPr>
-          <w:lang w:val="en-US"/>
-        </w:rPr>
-      </w:pPr>
-      <w:r>
-        <w:rPr>
-          <w:lang w:val="en-US"/>
-        </w:rPr>
         <w:br w:type="page"/>
       </w:r>
     </w:p>
     <w:p>
       <w:pPr>
-        <w:pStyle w:val="Heading1"/>
+        <w:pStyle w:val="Titolo1"/>
         <w:rPr>
           <w:lang w:val="en-US"/>
         </w:rPr>
@@ -7360,7 +7915,7 @@
     </w:p>
     <w:p>
       <w:pPr>
-        <w:pStyle w:val="Heading2"/>
+        <w:pStyle w:val="Titolo2"/>
         <w:rPr>
           <w:lang w:val="en-US"/>
         </w:rPr>
@@ -7375,57 +7930,197 @@
       <w:bookmarkEnd w:id="17"/>
     </w:p>
     <w:p>
-      <w:r>
-        <w:t>Test effettuato dal gruppo di sviluppo</w:t>
-      </w:r>
-    </w:p>
-    <w:p>
-      <w:pPr>
-        <w:pStyle w:val="Heading3"/>
+      <w:pPr>
+        <w:rPr>
+          <w:lang w:val="en-US"/>
+        </w:rPr>
+      </w:pPr>
+      <w:r>
+        <w:rPr>
+          <w:lang w:val="en-US"/>
+        </w:rPr>
+        <w:t xml:space="preserve">Test </w:t>
+      </w:r>
+      <w:proofErr w:type="spellStart"/>
+      <w:r>
+        <w:rPr>
+          <w:lang w:val="en-US"/>
+        </w:rPr>
+        <w:t>effettuato</w:t>
+      </w:r>
+      <w:proofErr w:type="spellEnd"/>
+      <w:r>
+        <w:rPr>
+          <w:lang w:val="en-US"/>
+        </w:rPr>
+        <w:t xml:space="preserve"> dal </w:t>
+      </w:r>
+      <w:proofErr w:type="spellStart"/>
+      <w:r>
+        <w:rPr>
+          <w:lang w:val="en-US"/>
+        </w:rPr>
+        <w:t>gruppo</w:t>
+      </w:r>
+      <w:proofErr w:type="spellEnd"/>
+      <w:r>
+        <w:rPr>
+          <w:lang w:val="en-US"/>
+        </w:rPr>
+        <w:t xml:space="preserve"> di </w:t>
+      </w:r>
+      <w:proofErr w:type="spellStart"/>
+      <w:r>
+        <w:rPr>
+          <w:lang w:val="en-US"/>
+        </w:rPr>
+        <w:t>sviluppo</w:t>
+      </w:r>
+      <w:proofErr w:type="spellEnd"/>
+    </w:p>
+    <w:p>
+      <w:pPr>
+        <w:pStyle w:val="Titolo3"/>
+        <w:rPr>
+          <w:lang w:val="en-US"/>
+        </w:rPr>
       </w:pPr>
       <w:bookmarkStart w:id="18" w:name="_Toc41400394"/>
       <w:r>
-        <w:t>Test funzionale</w:t>
+        <w:rPr>
+          <w:lang w:val="en-US"/>
+        </w:rPr>
+        <w:t xml:space="preserve">Test </w:t>
+      </w:r>
+      <w:proofErr w:type="spellStart"/>
+      <w:r>
+        <w:rPr>
+          <w:lang w:val="en-US"/>
+        </w:rPr>
+        <w:t>funzionale</w:t>
       </w:r>
       <w:bookmarkEnd w:id="18"/>
-    </w:p>
-    <w:p>
-      <w:pPr>
-        <w:pStyle w:val="Heading3"/>
+      <w:proofErr w:type="spellEnd"/>
+    </w:p>
+    <w:p>
+      <w:pPr>
+        <w:pStyle w:val="Titolo3"/>
+        <w:rPr>
+          <w:lang w:val="en-US"/>
+        </w:rPr>
       </w:pPr>
       <w:bookmarkStart w:id="19" w:name="_Toc41400395"/>
       <w:r>
-        <w:t>Test strutturale</w:t>
+        <w:rPr>
+          <w:lang w:val="en-US"/>
+        </w:rPr>
+        <w:t xml:space="preserve">Test </w:t>
+      </w:r>
+      <w:proofErr w:type="spellStart"/>
+      <w:r>
+        <w:rPr>
+          <w:lang w:val="en-US"/>
+        </w:rPr>
+        <w:t>strutturale</w:t>
       </w:r>
       <w:bookmarkEnd w:id="19"/>
-    </w:p>
-    <w:p/>
-    <w:p>
-      <w:pPr>
-        <w:pStyle w:val="Heading2"/>
+      <w:proofErr w:type="spellEnd"/>
+    </w:p>
+    <w:p>
+      <w:pPr>
+        <w:rPr>
+          <w:lang w:val="en-US"/>
+        </w:rPr>
+      </w:pPr>
+    </w:p>
+    <w:p>
+      <w:pPr>
+        <w:pStyle w:val="Titolo2"/>
+        <w:rPr>
+          <w:lang w:val="en-US"/>
+        </w:rPr>
       </w:pPr>
       <w:bookmarkStart w:id="20" w:name="_Toc41400396"/>
       <w:r>
+        <w:rPr>
+          <w:lang w:val="en-US"/>
+        </w:rPr>
         <w:t>Beta test</w:t>
       </w:r>
       <w:bookmarkEnd w:id="20"/>
     </w:p>
     <w:p>
-      <w:r>
-        <w:t>Test con gli utenti</w:t>
-      </w:r>
-    </w:p>
-    <w:p/>
-    <w:p/>
-    <w:p/>
-    <w:p>
-      <w:r>
+      <w:pPr>
+        <w:rPr>
+          <w:lang w:val="en-US"/>
+        </w:rPr>
+      </w:pPr>
+      <w:r>
+        <w:rPr>
+          <w:lang w:val="en-US"/>
+        </w:rPr>
+        <w:t xml:space="preserve">Test con </w:t>
+      </w:r>
+      <w:proofErr w:type="spellStart"/>
+      <w:r>
+        <w:rPr>
+          <w:lang w:val="en-US"/>
+        </w:rPr>
+        <w:t>gli</w:t>
+      </w:r>
+      <w:proofErr w:type="spellEnd"/>
+      <w:r>
+        <w:rPr>
+          <w:lang w:val="en-US"/>
+        </w:rPr>
+        <w:t xml:space="preserve"> </w:t>
+      </w:r>
+      <w:proofErr w:type="spellStart"/>
+      <w:r>
+        <w:rPr>
+          <w:lang w:val="en-US"/>
+        </w:rPr>
+        <w:t>utenti</w:t>
+      </w:r>
+      <w:proofErr w:type="spellEnd"/>
+    </w:p>
+    <w:p>
+      <w:pPr>
+        <w:rPr>
+          <w:lang w:val="en-US"/>
+        </w:rPr>
+      </w:pPr>
+    </w:p>
+    <w:p>
+      <w:pPr>
+        <w:rPr>
+          <w:lang w:val="en-US"/>
+        </w:rPr>
+      </w:pPr>
+    </w:p>
+    <w:p>
+      <w:pPr>
+        <w:rPr>
+          <w:lang w:val="en-US"/>
+        </w:rPr>
+      </w:pPr>
+    </w:p>
+    <w:p>
+      <w:pPr>
+        <w:rPr>
+          <w:lang w:val="en-US"/>
+        </w:rPr>
+      </w:pPr>
+      <w:r>
+        <w:rPr>
+          <w:lang w:val="en-US"/>
+        </w:rPr>
         <w:br w:type="page"/>
       </w:r>
     </w:p>
     <w:p>
       <w:pPr>
-        <w:pStyle w:val="Heading1"/>
+        <w:pStyle w:val="Titolo1"/>
       </w:pPr>
       <w:r>
         <w:lastRenderedPageBreak/>
@@ -7434,7 +8129,7 @@
     </w:p>
     <w:p>
       <w:pPr>
-        <w:pStyle w:val="Heading2"/>
+        <w:pStyle w:val="Titolo2"/>
       </w:pPr>
       <w:r>
         <w:t>Questionario SUS (System Usability Scale)</w:t>
@@ -12192,14 +12887,14 @@
     <w:p/>
     <w:p>
       <w:pPr>
-        <w:pStyle w:val="Heading2"/>
+        <w:pStyle w:val="Titolo2"/>
       </w:pPr>
     </w:p>
     <w:p/>
     <w:sectPr>
-      <w:headerReference w:type="default" r:id="rId10"/>
-      <w:footerReference w:type="even" r:id="rId11"/>
-      <w:footerReference w:type="default" r:id="rId12"/>
+      <w:headerReference w:type="default" r:id="rId17"/>
+      <w:footerReference w:type="even" r:id="rId18"/>
+      <w:footerReference w:type="default" r:id="rId19"/>
       <w:pgSz w:w="11900" w:h="16840"/>
       <w:pgMar w:top="2131" w:right="1134" w:bottom="1134" w:left="1134" w:header="708" w:footer="708" w:gutter="0"/>
       <w:cols w:space="708"/>
@@ -12233,7 +12928,7 @@
   <w:sdt>
     <w:sdtPr>
       <w:rPr>
-        <w:rStyle w:val="PageNumber"/>
+        <w:rStyle w:val="Numeropagina"/>
       </w:rPr>
       <w:id w:val="-1710180993"/>
       <w:docPartObj>
@@ -12244,27 +12939,27 @@
     <w:sdtContent>
       <w:p>
         <w:pPr>
-          <w:pStyle w:val="Footer"/>
+          <w:pStyle w:val="Pidipagina"/>
           <w:framePr w:wrap="none" w:vAnchor="text" w:hAnchor="margin" w:xAlign="right" w:y="1"/>
           <w:rPr>
-            <w:rStyle w:val="PageNumber"/>
+            <w:rStyle w:val="Numeropagina"/>
           </w:rPr>
         </w:pPr>
         <w:r>
           <w:rPr>
-            <w:rStyle w:val="PageNumber"/>
+            <w:rStyle w:val="Numeropagina"/>
           </w:rPr>
           <w:fldChar w:fldCharType="begin"/>
         </w:r>
         <w:r>
           <w:rPr>
-            <w:rStyle w:val="PageNumber"/>
+            <w:rStyle w:val="Numeropagina"/>
           </w:rPr>
           <w:instrText xml:space="preserve"> PAGE </w:instrText>
         </w:r>
         <w:r>
           <w:rPr>
-            <w:rStyle w:val="PageNumber"/>
+            <w:rStyle w:val="Numeropagina"/>
           </w:rPr>
           <w:fldChar w:fldCharType="end"/>
         </w:r>
@@ -12273,7 +12968,7 @@
   </w:sdt>
   <w:p>
     <w:pPr>
-      <w:pStyle w:val="Footer"/>
+      <w:pStyle w:val="Pidipagina"/>
       <w:ind w:right="360"/>
     </w:pPr>
   </w:p>
@@ -12285,7 +12980,7 @@
   <w:sdt>
     <w:sdtPr>
       <w:rPr>
-        <w:rStyle w:val="PageNumber"/>
+        <w:rStyle w:val="Numeropagina"/>
       </w:rPr>
       <w:id w:val="1010491907"/>
       <w:docPartObj>
@@ -12296,40 +12991,40 @@
     <w:sdtContent>
       <w:p>
         <w:pPr>
-          <w:pStyle w:val="Footer"/>
+          <w:pStyle w:val="Pidipagina"/>
           <w:framePr w:wrap="none" w:vAnchor="text" w:hAnchor="margin" w:xAlign="right" w:y="1"/>
           <w:rPr>
-            <w:rStyle w:val="PageNumber"/>
+            <w:rStyle w:val="Numeropagina"/>
           </w:rPr>
         </w:pPr>
         <w:r>
           <w:rPr>
-            <w:rStyle w:val="PageNumber"/>
+            <w:rStyle w:val="Numeropagina"/>
           </w:rPr>
           <w:fldChar w:fldCharType="begin"/>
         </w:r>
         <w:r>
           <w:rPr>
-            <w:rStyle w:val="PageNumber"/>
+            <w:rStyle w:val="Numeropagina"/>
           </w:rPr>
           <w:instrText xml:space="preserve"> PAGE </w:instrText>
         </w:r>
         <w:r>
           <w:rPr>
-            <w:rStyle w:val="PageNumber"/>
+            <w:rStyle w:val="Numeropagina"/>
           </w:rPr>
           <w:fldChar w:fldCharType="separate"/>
         </w:r>
         <w:r>
           <w:rPr>
-            <w:rStyle w:val="PageNumber"/>
+            <w:rStyle w:val="Numeropagina"/>
             <w:noProof/>
           </w:rPr>
           <w:t>2</w:t>
         </w:r>
         <w:r>
           <w:rPr>
-            <w:rStyle w:val="PageNumber"/>
+            <w:rStyle w:val="Numeropagina"/>
           </w:rPr>
           <w:fldChar w:fldCharType="end"/>
         </w:r>
@@ -12338,7 +13033,7 @@
   </w:sdt>
   <w:p>
     <w:pPr>
-      <w:pStyle w:val="Footer"/>
+      <w:pStyle w:val="Pidipagina"/>
       <w:ind w:right="360"/>
     </w:pPr>
     <w:r>
@@ -12350,9 +13045,11 @@
     <w:r>
       <w:fldChar w:fldCharType="end"/>
     </w:r>
+    <w:proofErr w:type="spellStart"/>
     <w:r>
       <w:t>BariGo</w:t>
     </w:r>
+    <w:proofErr w:type="spellEnd"/>
     <w:r>
       <w:t xml:space="preserve"> – PPM documentazione </w:t>
     </w:r>
@@ -12383,7 +13080,7 @@
 <w:hdr xmlns:wpc="http://schemas.microsoft.com/office/word/2010/wordprocessingCanvas" xmlns:cx="http://schemas.microsoft.com/office/drawing/2014/chartex" xmlns:cx1="http://schemas.microsoft.com/office/drawing/2015/9/8/chartex" xmlns:cx2="http://schemas.microsoft.com/office/drawing/2015/10/21/chartex" xmlns:cx3="http://schemas.microsoft.com/office/drawing/2016/5/9/chartex" xmlns:cx4="http://schemas.microsoft.com/office/drawing/2016/5/10/chartex" xmlns:cx5="http://schemas.microsoft.com/office/drawing/2016/5/11/chartex" xmlns:cx6="http://schemas.microsoft.com/office/drawing/2016/5/12/chartex" xmlns:cx7="http://schemas.microsoft.com/office/drawing/2016/5/13/chartex" xmlns:cx8="http://schemas.microsoft.com/office/drawing/2016/5/14/chartex" xmlns:mc="http://schemas.openxmlformats.org/markup-compatibility/2006" xmlns:aink="http://schemas.microsoft.com/office/drawing/2016/ink" xmlns:am3d="http://schemas.microsoft.com/office/drawing/2017/model3d" xmlns:o="urn:schemas-microsoft-com:office:office" xmlns:oel="http://schemas.microsoft.com/office/2019/extlst" xmlns:r="http://schemas.openxmlformats.org/officeDocument/2006/relationships" xmlns:m="http://schemas.openxmlformats.org/officeDocument/2006/math" xmlns:v="urn:schemas-microsoft-com:vml" xmlns:wp14="http://schemas.microsoft.com/office/word/2010/wordprocessingDrawing" xmlns:wp="http://schemas.openxmlformats.org/drawingml/2006/wordprocessingDrawing" xmlns:w10="urn:schemas-microsoft-com:office:word" xmlns:w="http://schemas.openxmlformats.org/wordprocessingml/2006/main" xmlns:w14="http://schemas.microsoft.com/office/word/2010/wordml" xmlns:w15="http://schemas.microsoft.com/office/word/2012/wordml" xmlns:w16cex="http://schemas.microsoft.com/office/word/2018/wordml/cex" xmlns:w16cid="http://schemas.microsoft.com/office/word/2016/wordml/cid" xmlns:w16="http://schemas.microsoft.com/office/word/2018/wordml" xmlns:w16du="http://schemas.microsoft.com/office/word/2023/wordml/word16du" xmlns:w16sdtdh="http://schemas.microsoft.com/office/word/2020/wordml/sdtdatahash" xmlns:w16sdtfl="http://schemas.microsoft.com/office/word/2024/wordml/sdtformatlock" xmlns:w16se="http://schemas.microsoft.com/office/word/2015/wordml/symex" xmlns:wpg="http://schemas.microsoft.com/office/word/2010/wordprocessingGroup" xmlns:wpi="http://schemas.microsoft.com/office/word/2010/wordprocessingInk" xmlns:wne="http://schemas.microsoft.com/office/word/2006/wordml" xmlns:wps="http://schemas.microsoft.com/office/word/2010/wordprocessingShape" mc:Ignorable="w14 w15 w16se w16cid w16 w16cex w16sdtdh w16sdtfl w16du wp14">
   <w:p>
     <w:pPr>
-      <w:pStyle w:val="Header"/>
+      <w:pStyle w:val="Intestazione"/>
     </w:pPr>
     <w:r>
       <w:rPr>
@@ -12426,7 +13123,7 @@
                       <w:txbxContent>
                         <w:p>
                           <w:pPr>
-                            <w:pStyle w:val="Header"/>
+                            <w:pStyle w:val="Intestazione"/>
                             <w:jc w:val="right"/>
                             <w:rPr>
                               <w:rFonts w:ascii="Garamond" w:hAnsi="Garamond"/>
@@ -12441,7 +13138,7 @@
                         </w:p>
                         <w:p>
                           <w:pPr>
-                            <w:pStyle w:val="Header"/>
+                            <w:pStyle w:val="Intestazione"/>
                             <w:jc w:val="right"/>
                             <w:rPr>
                               <w:rFonts w:ascii="Garamond" w:hAnsi="Garamond"/>
@@ -12462,7 +13159,7 @@
                         </w:p>
                         <w:p>
                           <w:pPr>
-                            <w:pStyle w:val="Header"/>
+                            <w:pStyle w:val="Intestazione"/>
                             <w:jc w:val="right"/>
                             <w:rPr>
                               <w:rFonts w:ascii="Garamond" w:hAnsi="Garamond"/>
@@ -12513,7 +13210,7 @@
                 <w:txbxContent>
                   <w:p>
                     <w:pPr>
-                      <w:pStyle w:val="Header"/>
+                      <w:pStyle w:val="Intestazione"/>
                       <w:jc w:val="right"/>
                       <w:rPr>
                         <w:rFonts w:ascii="Garamond" w:hAnsi="Garamond"/>
@@ -12528,7 +13225,7 @@
                   </w:p>
                   <w:p>
                     <w:pPr>
-                      <w:pStyle w:val="Header"/>
+                      <w:pStyle w:val="Intestazione"/>
                       <w:jc w:val="right"/>
                       <w:rPr>
                         <w:rFonts w:ascii="Garamond" w:hAnsi="Garamond"/>
@@ -12549,7 +13246,7 @@
                   </w:p>
                   <w:p>
                     <w:pPr>
-                      <w:pStyle w:val="Header"/>
+                      <w:pStyle w:val="Intestazione"/>
                       <w:jc w:val="right"/>
                       <w:rPr>
                         <w:rFonts w:ascii="Garamond" w:hAnsi="Garamond"/>
@@ -13338,6 +14035,119 @@
     </w:lvl>
   </w:abstractNum>
   <w:abstractNum w:abstractNumId="5" w15:restartNumberingAfterBreak="0">
+    <w:nsid w:val="151629A9"/>
+    <w:multiLevelType w:val="hybridMultilevel"/>
+    <w:tmpl w:val="3D98544C"/>
+    <w:lvl w:ilvl="0" w:tplc="08090001">
+      <w:start w:val="1"/>
+      <w:numFmt w:val="bullet"/>
+      <w:lvlText w:val=""/>
+      <w:lvlJc w:val="left"/>
+      <w:pPr>
+        <w:ind w:left="720" w:hanging="360"/>
+      </w:pPr>
+      <w:rPr>
+        <w:rFonts w:ascii="Symbol" w:hAnsi="Symbol" w:hint="default"/>
+      </w:rPr>
+    </w:lvl>
+    <w:lvl w:ilvl="1" w:tplc="08090003" w:tentative="1">
+      <w:start w:val="1"/>
+      <w:numFmt w:val="bullet"/>
+      <w:lvlText w:val="o"/>
+      <w:lvlJc w:val="left"/>
+      <w:pPr>
+        <w:ind w:left="1440" w:hanging="360"/>
+      </w:pPr>
+      <w:rPr>
+        <w:rFonts w:ascii="Courier New" w:hAnsi="Courier New" w:cs="Courier New" w:hint="default"/>
+      </w:rPr>
+    </w:lvl>
+    <w:lvl w:ilvl="2" w:tplc="08090005" w:tentative="1">
+      <w:start w:val="1"/>
+      <w:numFmt w:val="bullet"/>
+      <w:lvlText w:val=""/>
+      <w:lvlJc w:val="left"/>
+      <w:pPr>
+        <w:ind w:left="2160" w:hanging="360"/>
+      </w:pPr>
+      <w:rPr>
+        <w:rFonts w:ascii="Wingdings" w:hAnsi="Wingdings" w:hint="default"/>
+      </w:rPr>
+    </w:lvl>
+    <w:lvl w:ilvl="3" w:tplc="08090001" w:tentative="1">
+      <w:start w:val="1"/>
+      <w:numFmt w:val="bullet"/>
+      <w:lvlText w:val=""/>
+      <w:lvlJc w:val="left"/>
+      <w:pPr>
+        <w:ind w:left="2880" w:hanging="360"/>
+      </w:pPr>
+      <w:rPr>
+        <w:rFonts w:ascii="Symbol" w:hAnsi="Symbol" w:hint="default"/>
+      </w:rPr>
+    </w:lvl>
+    <w:lvl w:ilvl="4" w:tplc="08090003" w:tentative="1">
+      <w:start w:val="1"/>
+      <w:numFmt w:val="bullet"/>
+      <w:lvlText w:val="o"/>
+      <w:lvlJc w:val="left"/>
+      <w:pPr>
+        <w:ind w:left="3600" w:hanging="360"/>
+      </w:pPr>
+      <w:rPr>
+        <w:rFonts w:ascii="Courier New" w:hAnsi="Courier New" w:cs="Courier New" w:hint="default"/>
+      </w:rPr>
+    </w:lvl>
+    <w:lvl w:ilvl="5" w:tplc="08090005" w:tentative="1">
+      <w:start w:val="1"/>
+      <w:numFmt w:val="bullet"/>
+      <w:lvlText w:val=""/>
+      <w:lvlJc w:val="left"/>
+      <w:pPr>
+        <w:ind w:left="4320" w:hanging="360"/>
+      </w:pPr>
+      <w:rPr>
+        <w:rFonts w:ascii="Wingdings" w:hAnsi="Wingdings" w:hint="default"/>
+      </w:rPr>
+    </w:lvl>
+    <w:lvl w:ilvl="6" w:tplc="08090001" w:tentative="1">
+      <w:start w:val="1"/>
+      <w:numFmt w:val="bullet"/>
+      <w:lvlText w:val=""/>
+      <w:lvlJc w:val="left"/>
+      <w:pPr>
+        <w:ind w:left="5040" w:hanging="360"/>
+      </w:pPr>
+      <w:rPr>
+        <w:rFonts w:ascii="Symbol" w:hAnsi="Symbol" w:hint="default"/>
+      </w:rPr>
+    </w:lvl>
+    <w:lvl w:ilvl="7" w:tplc="08090003" w:tentative="1">
+      <w:start w:val="1"/>
+      <w:numFmt w:val="bullet"/>
+      <w:lvlText w:val="o"/>
+      <w:lvlJc w:val="left"/>
+      <w:pPr>
+        <w:ind w:left="5760" w:hanging="360"/>
+      </w:pPr>
+      <w:rPr>
+        <w:rFonts w:ascii="Courier New" w:hAnsi="Courier New" w:cs="Courier New" w:hint="default"/>
+      </w:rPr>
+    </w:lvl>
+    <w:lvl w:ilvl="8" w:tplc="08090005" w:tentative="1">
+      <w:start w:val="1"/>
+      <w:numFmt w:val="bullet"/>
+      <w:lvlText w:val=""/>
+      <w:lvlJc w:val="left"/>
+      <w:pPr>
+        <w:ind w:left="6480" w:hanging="360"/>
+      </w:pPr>
+      <w:rPr>
+        <w:rFonts w:ascii="Wingdings" w:hAnsi="Wingdings" w:hint="default"/>
+      </w:rPr>
+    </w:lvl>
+  </w:abstractNum>
+  <w:abstractNum w:abstractNumId="6" w15:restartNumberingAfterBreak="0">
     <w:nsid w:val="1DB02C46"/>
     <w:multiLevelType w:val="multilevel"/>
     <w:tmpl w:val="4CDE6C50"/>
@@ -13486,7 +14296,7 @@
       </w:rPr>
     </w:lvl>
   </w:abstractNum>
-  <w:abstractNum w:abstractNumId="6" w15:restartNumberingAfterBreak="0">
+  <w:abstractNum w:abstractNumId="7" w15:restartNumberingAfterBreak="0">
     <w:nsid w:val="1E56776B"/>
     <w:multiLevelType w:val="hybridMultilevel"/>
     <w:tmpl w:val="176E29CA"/>
@@ -13599,7 +14409,7 @@
       </w:rPr>
     </w:lvl>
   </w:abstractNum>
-  <w:abstractNum w:abstractNumId="7" w15:restartNumberingAfterBreak="0">
+  <w:abstractNum w:abstractNumId="8" w15:restartNumberingAfterBreak="0">
     <w:nsid w:val="1F7D4069"/>
     <w:multiLevelType w:val="multilevel"/>
     <w:tmpl w:val="A1AA9F92"/>
@@ -13748,7 +14558,7 @@
       </w:rPr>
     </w:lvl>
   </w:abstractNum>
-  <w:abstractNum w:abstractNumId="8" w15:restartNumberingAfterBreak="0">
+  <w:abstractNum w:abstractNumId="9" w15:restartNumberingAfterBreak="0">
     <w:nsid w:val="21520C42"/>
     <w:multiLevelType w:val="multilevel"/>
     <w:tmpl w:val="DDD49B2E"/>
@@ -13897,7 +14707,7 @@
       </w:rPr>
     </w:lvl>
   </w:abstractNum>
-  <w:abstractNum w:abstractNumId="9" w15:restartNumberingAfterBreak="0">
+  <w:abstractNum w:abstractNumId="10" w15:restartNumberingAfterBreak="0">
     <w:nsid w:val="220D794F"/>
     <w:multiLevelType w:val="multilevel"/>
     <w:tmpl w:val="5A56145A"/>
@@ -14046,7 +14856,7 @@
       </w:rPr>
     </w:lvl>
   </w:abstractNum>
-  <w:abstractNum w:abstractNumId="10" w15:restartNumberingAfterBreak="0">
+  <w:abstractNum w:abstractNumId="11" w15:restartNumberingAfterBreak="0">
     <w:nsid w:val="25E21224"/>
     <w:multiLevelType w:val="multilevel"/>
     <w:tmpl w:val="5BB6A752"/>
@@ -14195,7 +15005,7 @@
       </w:rPr>
     </w:lvl>
   </w:abstractNum>
-  <w:abstractNum w:abstractNumId="11" w15:restartNumberingAfterBreak="0">
+  <w:abstractNum w:abstractNumId="12" w15:restartNumberingAfterBreak="0">
     <w:nsid w:val="29710465"/>
     <w:multiLevelType w:val="multilevel"/>
     <w:tmpl w:val="9FD2CFC0"/>
@@ -14344,7 +15154,7 @@
       </w:rPr>
     </w:lvl>
   </w:abstractNum>
-  <w:abstractNum w:abstractNumId="12" w15:restartNumberingAfterBreak="0">
+  <w:abstractNum w:abstractNumId="13" w15:restartNumberingAfterBreak="0">
     <w:nsid w:val="2DF9538D"/>
     <w:multiLevelType w:val="multilevel"/>
     <w:tmpl w:val="3AF40AB2"/>
@@ -14493,7 +15303,7 @@
       </w:rPr>
     </w:lvl>
   </w:abstractNum>
-  <w:abstractNum w:abstractNumId="13" w15:restartNumberingAfterBreak="0">
+  <w:abstractNum w:abstractNumId="14" w15:restartNumberingAfterBreak="0">
     <w:nsid w:val="33BA2E93"/>
     <w:multiLevelType w:val="multilevel"/>
     <w:tmpl w:val="D99CBDB4"/>
@@ -14642,7 +15452,7 @@
       </w:rPr>
     </w:lvl>
   </w:abstractNum>
-  <w:abstractNum w:abstractNumId="14" w15:restartNumberingAfterBreak="0">
+  <w:abstractNum w:abstractNumId="15" w15:restartNumberingAfterBreak="0">
     <w:nsid w:val="3C640261"/>
     <w:multiLevelType w:val="multilevel"/>
     <w:tmpl w:val="D2963D40"/>
@@ -14791,7 +15601,7 @@
       </w:rPr>
     </w:lvl>
   </w:abstractNum>
-  <w:abstractNum w:abstractNumId="15" w15:restartNumberingAfterBreak="0">
+  <w:abstractNum w:abstractNumId="16" w15:restartNumberingAfterBreak="0">
     <w:nsid w:val="418B2753"/>
     <w:multiLevelType w:val="multilevel"/>
     <w:tmpl w:val="A3E03B3E"/>
@@ -14940,7 +15750,7 @@
       </w:rPr>
     </w:lvl>
   </w:abstractNum>
-  <w:abstractNum w:abstractNumId="16" w15:restartNumberingAfterBreak="0">
+  <w:abstractNum w:abstractNumId="17" w15:restartNumberingAfterBreak="0">
     <w:nsid w:val="550323FA"/>
     <w:multiLevelType w:val="multilevel"/>
     <w:tmpl w:val="D66A36EA"/>
@@ -15089,7 +15899,7 @@
       </w:rPr>
     </w:lvl>
   </w:abstractNum>
-  <w:abstractNum w:abstractNumId="17" w15:restartNumberingAfterBreak="0">
+  <w:abstractNum w:abstractNumId="18" w15:restartNumberingAfterBreak="0">
     <w:nsid w:val="569152B3"/>
     <w:multiLevelType w:val="multilevel"/>
     <w:tmpl w:val="CA36018A"/>
@@ -15238,7 +16048,7 @@
       </w:rPr>
     </w:lvl>
   </w:abstractNum>
-  <w:abstractNum w:abstractNumId="18" w15:restartNumberingAfterBreak="0">
+  <w:abstractNum w:abstractNumId="19" w15:restartNumberingAfterBreak="0">
     <w:nsid w:val="56C47014"/>
     <w:multiLevelType w:val="multilevel"/>
     <w:tmpl w:val="F410D10E"/>
@@ -15387,7 +16197,7 @@
       </w:rPr>
     </w:lvl>
   </w:abstractNum>
-  <w:abstractNum w:abstractNumId="19" w15:restartNumberingAfterBreak="0">
+  <w:abstractNum w:abstractNumId="20" w15:restartNumberingAfterBreak="0">
     <w:nsid w:val="57407E6F"/>
     <w:multiLevelType w:val="multilevel"/>
     <w:tmpl w:val="6EE85614"/>
@@ -15536,7 +16346,7 @@
       </w:rPr>
     </w:lvl>
   </w:abstractNum>
-  <w:abstractNum w:abstractNumId="20" w15:restartNumberingAfterBreak="0">
+  <w:abstractNum w:abstractNumId="21" w15:restartNumberingAfterBreak="0">
     <w:nsid w:val="5A750A7A"/>
     <w:multiLevelType w:val="multilevel"/>
     <w:tmpl w:val="52E0AF26"/>
@@ -15685,7 +16495,7 @@
       </w:rPr>
     </w:lvl>
   </w:abstractNum>
-  <w:abstractNum w:abstractNumId="21" w15:restartNumberingAfterBreak="0">
+  <w:abstractNum w:abstractNumId="22" w15:restartNumberingAfterBreak="0">
     <w:nsid w:val="64554E97"/>
     <w:multiLevelType w:val="multilevel"/>
     <w:tmpl w:val="9AA41674"/>
@@ -15834,7 +16644,7 @@
       </w:rPr>
     </w:lvl>
   </w:abstractNum>
-  <w:abstractNum w:abstractNumId="22" w15:restartNumberingAfterBreak="0">
+  <w:abstractNum w:abstractNumId="23" w15:restartNumberingAfterBreak="0">
     <w:nsid w:val="6CFC5A1A"/>
     <w:multiLevelType w:val="multilevel"/>
     <w:tmpl w:val="E0CEE3F6"/>
@@ -15983,7 +16793,7 @@
       </w:rPr>
     </w:lvl>
   </w:abstractNum>
-  <w:abstractNum w:abstractNumId="23" w15:restartNumberingAfterBreak="0">
+  <w:abstractNum w:abstractNumId="24" w15:restartNumberingAfterBreak="0">
     <w:nsid w:val="6D2D267F"/>
     <w:multiLevelType w:val="multilevel"/>
     <w:tmpl w:val="FDD43278"/>
@@ -16132,7 +16942,7 @@
       </w:rPr>
     </w:lvl>
   </w:abstractNum>
-  <w:abstractNum w:abstractNumId="24" w15:restartNumberingAfterBreak="0">
+  <w:abstractNum w:abstractNumId="25" w15:restartNumberingAfterBreak="0">
     <w:nsid w:val="6E311087"/>
     <w:multiLevelType w:val="multilevel"/>
     <w:tmpl w:val="9482EC5E"/>
@@ -16281,7 +17091,7 @@
       </w:rPr>
     </w:lvl>
   </w:abstractNum>
-  <w:abstractNum w:abstractNumId="25" w15:restartNumberingAfterBreak="0">
+  <w:abstractNum w:abstractNumId="26" w15:restartNumberingAfterBreak="0">
     <w:nsid w:val="77D279F2"/>
     <w:multiLevelType w:val="multilevel"/>
     <w:tmpl w:val="1B1C4968"/>
@@ -16434,52 +17244,52 @@
     <w:abstractNumId w:val="0"/>
   </w:num>
   <w:num w:numId="2" w16cid:durableId="1262689912">
-    <w:abstractNumId w:val="6"/>
+    <w:abstractNumId w:val="7"/>
   </w:num>
   <w:num w:numId="3" w16cid:durableId="1301419329">
     <w:abstractNumId w:val="1"/>
   </w:num>
   <w:num w:numId="4" w16cid:durableId="1683707063">
+    <w:abstractNumId w:val="9"/>
+  </w:num>
+  <w:num w:numId="5" w16cid:durableId="1190417051">
+    <w:abstractNumId w:val="19"/>
+  </w:num>
+  <w:num w:numId="6" w16cid:durableId="460541887">
+    <w:abstractNumId w:val="16"/>
+  </w:num>
+  <w:num w:numId="7" w16cid:durableId="1342775051">
+    <w:abstractNumId w:val="11"/>
+  </w:num>
+  <w:num w:numId="8" w16cid:durableId="1296375614">
+    <w:abstractNumId w:val="13"/>
+  </w:num>
+  <w:num w:numId="9" w16cid:durableId="611059763">
+    <w:abstractNumId w:val="18"/>
+  </w:num>
+  <w:num w:numId="10" w16cid:durableId="688028770">
+    <w:abstractNumId w:val="14"/>
+  </w:num>
+  <w:num w:numId="11" w16cid:durableId="6102126">
+    <w:abstractNumId w:val="23"/>
+  </w:num>
+  <w:num w:numId="12" w16cid:durableId="1119108405">
+    <w:abstractNumId w:val="12"/>
+  </w:num>
+  <w:num w:numId="13" w16cid:durableId="899638478">
+    <w:abstractNumId w:val="24"/>
+  </w:num>
+  <w:num w:numId="14" w16cid:durableId="1726370354">
+    <w:abstractNumId w:val="21"/>
+  </w:num>
+  <w:num w:numId="15" w16cid:durableId="629357910">
     <w:abstractNumId w:val="8"/>
   </w:num>
-  <w:num w:numId="5" w16cid:durableId="1190417051">
-    <w:abstractNumId w:val="18"/>
-  </w:num>
-  <w:num w:numId="6" w16cid:durableId="460541887">
-    <w:abstractNumId w:val="15"/>
-  </w:num>
-  <w:num w:numId="7" w16cid:durableId="1342775051">
-    <w:abstractNumId w:val="10"/>
-  </w:num>
-  <w:num w:numId="8" w16cid:durableId="1296375614">
-    <w:abstractNumId w:val="12"/>
-  </w:num>
-  <w:num w:numId="9" w16cid:durableId="611059763">
-    <w:abstractNumId w:val="17"/>
-  </w:num>
-  <w:num w:numId="10" w16cid:durableId="688028770">
-    <w:abstractNumId w:val="13"/>
-  </w:num>
-  <w:num w:numId="11" w16cid:durableId="6102126">
-    <w:abstractNumId w:val="22"/>
-  </w:num>
-  <w:num w:numId="12" w16cid:durableId="1119108405">
-    <w:abstractNumId w:val="11"/>
-  </w:num>
-  <w:num w:numId="13" w16cid:durableId="899638478">
-    <w:abstractNumId w:val="23"/>
-  </w:num>
-  <w:num w:numId="14" w16cid:durableId="1726370354">
+  <w:num w:numId="16" w16cid:durableId="1679388242">
     <w:abstractNumId w:val="20"/>
   </w:num>
-  <w:num w:numId="15" w16cid:durableId="629357910">
-    <w:abstractNumId w:val="7"/>
-  </w:num>
-  <w:num w:numId="16" w16cid:durableId="1679388242">
-    <w:abstractNumId w:val="19"/>
-  </w:num>
   <w:num w:numId="17" w16cid:durableId="1665232446">
-    <w:abstractNumId w:val="5"/>
+    <w:abstractNumId w:val="6"/>
   </w:num>
   <w:num w:numId="18" w16cid:durableId="849176909">
     <w:abstractNumId w:val="4"/>
@@ -16491,22 +17301,25 @@
     <w:abstractNumId w:val="2"/>
   </w:num>
   <w:num w:numId="21" w16cid:durableId="1229531030">
+    <w:abstractNumId w:val="26"/>
+  </w:num>
+  <w:num w:numId="22" w16cid:durableId="142897802">
+    <w:abstractNumId w:val="17"/>
+  </w:num>
+  <w:num w:numId="23" w16cid:durableId="967780800">
     <w:abstractNumId w:val="25"/>
   </w:num>
-  <w:num w:numId="22" w16cid:durableId="142897802">
-    <w:abstractNumId w:val="16"/>
-  </w:num>
-  <w:num w:numId="23" w16cid:durableId="967780800">
-    <w:abstractNumId w:val="24"/>
-  </w:num>
   <w:num w:numId="24" w16cid:durableId="1779643519">
-    <w:abstractNumId w:val="21"/>
+    <w:abstractNumId w:val="22"/>
   </w:num>
   <w:num w:numId="25" w16cid:durableId="472218085">
-    <w:abstractNumId w:val="14"/>
+    <w:abstractNumId w:val="15"/>
   </w:num>
   <w:num w:numId="26" w16cid:durableId="295137311">
-    <w:abstractNumId w:val="9"/>
+    <w:abstractNumId w:val="10"/>
+  </w:num>
+  <w:num w:numId="27" w16cid:durableId="1395470546">
+    <w:abstractNumId w:val="5"/>
   </w:num>
   <w:numIdMacAtCleanup w:val="19"/>
 </w:numbering>
@@ -16903,7 +17716,7 @@
     <w:lsdException w:name="Unresolved Mention" w:semiHidden="1" w:unhideWhenUsed="1"/>
     <w:lsdException w:name="Smart Link" w:semiHidden="1" w:unhideWhenUsed="1"/>
   </w:latentStyles>
-  <w:style w:type="paragraph" w:default="1" w:styleId="Normal">
+  <w:style w:type="paragraph" w:default="1" w:styleId="Normale">
     <w:name w:val="Normal"/>
     <w:qFormat/>
     <w:rsid w:val="009B05D1"/>
@@ -16911,11 +17724,11 @@
       <w:rFonts w:ascii="Avenir Book" w:hAnsi="Avenir Book"/>
     </w:rPr>
   </w:style>
-  <w:style w:type="paragraph" w:styleId="Heading1">
+  <w:style w:type="paragraph" w:styleId="Titolo1">
     <w:name w:val="heading 1"/>
-    <w:basedOn w:val="Normal"/>
-    <w:next w:val="Normal"/>
-    <w:link w:val="Heading1Char"/>
+    <w:basedOn w:val="Normale"/>
+    <w:next w:val="Normale"/>
+    <w:link w:val="Titolo1Carattere"/>
     <w:uiPriority w:val="9"/>
     <w:qFormat/>
     <w:rsid w:val="00995791"/>
@@ -16933,11 +17746,11 @@
       <w:szCs w:val="32"/>
     </w:rPr>
   </w:style>
-  <w:style w:type="paragraph" w:styleId="Heading2">
+  <w:style w:type="paragraph" w:styleId="Titolo2">
     <w:name w:val="heading 2"/>
-    <w:basedOn w:val="Normal"/>
-    <w:next w:val="Normal"/>
-    <w:link w:val="Heading2Char"/>
+    <w:basedOn w:val="Normale"/>
+    <w:next w:val="Normale"/>
+    <w:link w:val="Titolo2Carattere"/>
     <w:uiPriority w:val="9"/>
     <w:unhideWhenUsed/>
     <w:qFormat/>
@@ -16955,11 +17768,11 @@
       <w:szCs w:val="26"/>
     </w:rPr>
   </w:style>
-  <w:style w:type="paragraph" w:styleId="Heading3">
+  <w:style w:type="paragraph" w:styleId="Titolo3">
     <w:name w:val="heading 3"/>
-    <w:basedOn w:val="Heading2"/>
-    <w:next w:val="Normal"/>
-    <w:link w:val="Heading3Char"/>
+    <w:basedOn w:val="Titolo2"/>
+    <w:next w:val="Normale"/>
+    <w:link w:val="Titolo3Carattere"/>
     <w:uiPriority w:val="9"/>
     <w:unhideWhenUsed/>
     <w:qFormat/>
@@ -16974,11 +17787,11 @@
       <w:szCs w:val="24"/>
     </w:rPr>
   </w:style>
-  <w:style w:type="paragraph" w:styleId="Heading4">
+  <w:style w:type="paragraph" w:styleId="Titolo4">
     <w:name w:val="heading 4"/>
-    <w:basedOn w:val="Normal"/>
-    <w:next w:val="Normal"/>
-    <w:link w:val="Heading4Char"/>
+    <w:basedOn w:val="Normale"/>
+    <w:next w:val="Normale"/>
+    <w:link w:val="Titolo4Carattere"/>
     <w:uiPriority w:val="9"/>
     <w:unhideWhenUsed/>
     <w:qFormat/>
@@ -16996,12 +17809,13 @@
       <w:color w:val="2F5496" w:themeColor="accent1" w:themeShade="BF"/>
     </w:rPr>
   </w:style>
-  <w:style w:type="character" w:default="1" w:styleId="DefaultParagraphFont">
+  <w:style w:type="character" w:default="1" w:styleId="Carpredefinitoparagrafo">
     <w:name w:val="Default Paragraph Font"/>
     <w:uiPriority w:val="1"/>
+    <w:semiHidden/>
     <w:unhideWhenUsed/>
   </w:style>
-  <w:style w:type="table" w:default="1" w:styleId="TableNormal">
+  <w:style w:type="table" w:default="1" w:styleId="Tabellanormale">
     <w:name w:val="Normal Table"/>
     <w:uiPriority w:val="99"/>
     <w:semiHidden/>
@@ -17016,17 +17830,17 @@
       </w:tblCellMar>
     </w:tblPr>
   </w:style>
-  <w:style w:type="numbering" w:default="1" w:styleId="NoList">
+  <w:style w:type="numbering" w:default="1" w:styleId="Nessunelenco">
     <w:name w:val="No List"/>
     <w:uiPriority w:val="99"/>
     <w:semiHidden/>
     <w:unhideWhenUsed/>
   </w:style>
-  <w:style w:type="paragraph" w:styleId="Title">
+  <w:style w:type="paragraph" w:styleId="Titolo">
     <w:name w:val="Title"/>
-    <w:basedOn w:val="Normal"/>
-    <w:next w:val="Normal"/>
-    <w:link w:val="TitleChar"/>
+    <w:basedOn w:val="Normale"/>
+    <w:next w:val="Normale"/>
+    <w:link w:val="TitoloCarattere"/>
     <w:uiPriority w:val="10"/>
     <w:qFormat/>
     <w:rsid w:val="00702558"/>
@@ -17045,10 +17859,10 @@
       <w:szCs w:val="56"/>
     </w:rPr>
   </w:style>
-  <w:style w:type="character" w:customStyle="1" w:styleId="TitleChar">
-    <w:name w:val="Title Char"/>
-    <w:basedOn w:val="DefaultParagraphFont"/>
-    <w:link w:val="Title"/>
+  <w:style w:type="character" w:customStyle="1" w:styleId="TitoloCarattere">
+    <w:name w:val="Titolo Carattere"/>
+    <w:basedOn w:val="Carpredefinitoparagrafo"/>
+    <w:link w:val="Titolo"/>
     <w:uiPriority w:val="10"/>
     <w:rsid w:val="00702558"/>
     <w:rPr>
@@ -17060,10 +17874,10 @@
       <w:szCs w:val="56"/>
     </w:rPr>
   </w:style>
-  <w:style w:type="paragraph" w:styleId="Header">
+  <w:style w:type="paragraph" w:styleId="Intestazione">
     <w:name w:val="header"/>
-    <w:basedOn w:val="Normal"/>
-    <w:link w:val="HeaderChar"/>
+    <w:basedOn w:val="Normale"/>
+    <w:link w:val="IntestazioneCarattere"/>
     <w:uiPriority w:val="99"/>
     <w:unhideWhenUsed/>
     <w:rsid w:val="00702558"/>
@@ -17074,17 +17888,17 @@
       </w:tabs>
     </w:pPr>
   </w:style>
-  <w:style w:type="character" w:customStyle="1" w:styleId="HeaderChar">
-    <w:name w:val="Header Char"/>
-    <w:basedOn w:val="DefaultParagraphFont"/>
-    <w:link w:val="Header"/>
+  <w:style w:type="character" w:customStyle="1" w:styleId="IntestazioneCarattere">
+    <w:name w:val="Intestazione Carattere"/>
+    <w:basedOn w:val="Carpredefinitoparagrafo"/>
+    <w:link w:val="Intestazione"/>
     <w:uiPriority w:val="99"/>
     <w:rsid w:val="00702558"/>
   </w:style>
-  <w:style w:type="paragraph" w:styleId="Footer">
+  <w:style w:type="paragraph" w:styleId="Pidipagina">
     <w:name w:val="footer"/>
-    <w:basedOn w:val="Normal"/>
-    <w:link w:val="FooterChar"/>
+    <w:basedOn w:val="Normale"/>
+    <w:link w:val="PidipaginaCarattere"/>
     <w:uiPriority w:val="99"/>
     <w:unhideWhenUsed/>
     <w:rsid w:val="00702558"/>
@@ -17095,16 +17909,16 @@
       </w:tabs>
     </w:pPr>
   </w:style>
-  <w:style w:type="character" w:customStyle="1" w:styleId="FooterChar">
-    <w:name w:val="Footer Char"/>
-    <w:basedOn w:val="DefaultParagraphFont"/>
-    <w:link w:val="Footer"/>
+  <w:style w:type="character" w:customStyle="1" w:styleId="PidipaginaCarattere">
+    <w:name w:val="Piè di pagina Carattere"/>
+    <w:basedOn w:val="Carpredefinitoparagrafo"/>
+    <w:link w:val="Pidipagina"/>
     <w:uiPriority w:val="99"/>
     <w:rsid w:val="00702558"/>
   </w:style>
-  <w:style w:type="character" w:styleId="Strong">
+  <w:style w:type="character" w:styleId="Enfasigrassetto">
     <w:name w:val="Strong"/>
-    <w:basedOn w:val="DefaultParagraphFont"/>
+    <w:basedOn w:val="Carpredefinitoparagrafo"/>
     <w:uiPriority w:val="22"/>
     <w:qFormat/>
     <w:rsid w:val="00702558"/>
@@ -17113,10 +17927,10 @@
       <w:bCs/>
     </w:rPr>
   </w:style>
-  <w:style w:type="character" w:customStyle="1" w:styleId="Heading1Char">
-    <w:name w:val="Heading 1 Char"/>
-    <w:basedOn w:val="DefaultParagraphFont"/>
-    <w:link w:val="Heading1"/>
+  <w:style w:type="character" w:customStyle="1" w:styleId="Titolo1Carattere">
+    <w:name w:val="Titolo 1 Carattere"/>
+    <w:basedOn w:val="Carpredefinitoparagrafo"/>
+    <w:link w:val="Titolo1"/>
     <w:uiPriority w:val="9"/>
     <w:rsid w:val="00995791"/>
     <w:rPr>
@@ -17127,10 +17941,10 @@
       <w:szCs w:val="32"/>
     </w:rPr>
   </w:style>
-  <w:style w:type="character" w:customStyle="1" w:styleId="Heading2Char">
-    <w:name w:val="Heading 2 Char"/>
-    <w:basedOn w:val="DefaultParagraphFont"/>
-    <w:link w:val="Heading2"/>
+  <w:style w:type="character" w:customStyle="1" w:styleId="Titolo2Carattere">
+    <w:name w:val="Titolo 2 Carattere"/>
+    <w:basedOn w:val="Carpredefinitoparagrafo"/>
+    <w:link w:val="Titolo2"/>
     <w:uiPriority w:val="9"/>
     <w:rsid w:val="00995791"/>
     <w:rPr>
@@ -17140,10 +17954,10 @@
       <w:szCs w:val="26"/>
     </w:rPr>
   </w:style>
-  <w:style w:type="paragraph" w:styleId="TOC1">
+  <w:style w:type="paragraph" w:styleId="Sommario1">
     <w:name w:val="toc 1"/>
-    <w:basedOn w:val="Normal"/>
-    <w:next w:val="Normal"/>
+    <w:basedOn w:val="Normale"/>
+    <w:next w:val="Normale"/>
     <w:autoRedefine/>
     <w:uiPriority w:val="39"/>
     <w:unhideWhenUsed/>
@@ -17152,10 +17966,10 @@
       <w:spacing w:after="100"/>
     </w:pPr>
   </w:style>
-  <w:style w:type="paragraph" w:styleId="TOC2">
+  <w:style w:type="paragraph" w:styleId="Sommario2">
     <w:name w:val="toc 2"/>
-    <w:basedOn w:val="Normal"/>
-    <w:next w:val="Normal"/>
+    <w:basedOn w:val="Normale"/>
+    <w:next w:val="Normale"/>
     <w:autoRedefine/>
     <w:uiPriority w:val="39"/>
     <w:unhideWhenUsed/>
@@ -17165,9 +17979,9 @@
       <w:ind w:left="240"/>
     </w:pPr>
   </w:style>
-  <w:style w:type="character" w:styleId="Hyperlink">
+  <w:style w:type="character" w:styleId="Collegamentoipertestuale">
     <w:name w:val="Hyperlink"/>
-    <w:basedOn w:val="DefaultParagraphFont"/>
+    <w:basedOn w:val="Carpredefinitoparagrafo"/>
     <w:uiPriority w:val="99"/>
     <w:unhideWhenUsed/>
     <w:rsid w:val="00EA19EC"/>
@@ -17176,17 +17990,17 @@
       <w:u w:val="single"/>
     </w:rPr>
   </w:style>
-  <w:style w:type="character" w:styleId="PageNumber">
+  <w:style w:type="character" w:styleId="Numeropagina">
     <w:name w:val="page number"/>
-    <w:basedOn w:val="DefaultParagraphFont"/>
+    <w:basedOn w:val="Carpredefinitoparagrafo"/>
     <w:uiPriority w:val="99"/>
     <w:semiHidden/>
     <w:unhideWhenUsed/>
     <w:rsid w:val="0012669A"/>
   </w:style>
-  <w:style w:type="paragraph" w:styleId="ListParagraph">
+  <w:style w:type="paragraph" w:styleId="Paragrafoelenco">
     <w:name w:val="List Paragraph"/>
-    <w:basedOn w:val="Normal"/>
+    <w:basedOn w:val="Normale"/>
     <w:uiPriority w:val="34"/>
     <w:qFormat/>
     <w:rsid w:val="00306314"/>
@@ -17195,10 +18009,10 @@
       <w:contextualSpacing/>
     </w:pPr>
   </w:style>
-  <w:style w:type="character" w:customStyle="1" w:styleId="Heading3Char">
-    <w:name w:val="Heading 3 Char"/>
-    <w:basedOn w:val="DefaultParagraphFont"/>
-    <w:link w:val="Heading3"/>
+  <w:style w:type="character" w:customStyle="1" w:styleId="Titolo3Carattere">
+    <w:name w:val="Titolo 3 Carattere"/>
+    <w:basedOn w:val="Carpredefinitoparagrafo"/>
+    <w:link w:val="Titolo3"/>
     <w:uiPriority w:val="9"/>
     <w:rsid w:val="001C7EF9"/>
     <w:rPr>
@@ -17209,10 +18023,10 @@
       <w:sz w:val="28"/>
     </w:rPr>
   </w:style>
-  <w:style w:type="paragraph" w:styleId="TOC3">
+  <w:style w:type="paragraph" w:styleId="Sommario3">
     <w:name w:val="toc 3"/>
-    <w:basedOn w:val="Normal"/>
-    <w:next w:val="Normal"/>
+    <w:basedOn w:val="Normale"/>
+    <w:next w:val="Normale"/>
     <w:autoRedefine/>
     <w:uiPriority w:val="39"/>
     <w:unhideWhenUsed/>
@@ -17222,10 +18036,10 @@
       <w:ind w:left="480"/>
     </w:pPr>
   </w:style>
-  <w:style w:type="character" w:customStyle="1" w:styleId="Heading4Char">
-    <w:name w:val="Heading 4 Char"/>
-    <w:basedOn w:val="DefaultParagraphFont"/>
-    <w:link w:val="Heading4"/>
+  <w:style w:type="character" w:customStyle="1" w:styleId="Titolo4Carattere">
+    <w:name w:val="Titolo 4 Carattere"/>
+    <w:basedOn w:val="Carpredefinitoparagrafo"/>
+    <w:link w:val="Titolo4"/>
     <w:uiPriority w:val="9"/>
     <w:rsid w:val="00633A51"/>
     <w:rPr>
@@ -17235,9 +18049,9 @@
       <w:color w:val="2F5496" w:themeColor="accent1" w:themeShade="BF"/>
     </w:rPr>
   </w:style>
-  <w:style w:type="paragraph" w:styleId="NormalWeb">
+  <w:style w:type="paragraph" w:styleId="NormaleWeb">
     <w:name w:val="Normal (Web)"/>
-    <w:basedOn w:val="Normal"/>
+    <w:basedOn w:val="Normale"/>
     <w:uiPriority w:val="99"/>
     <w:unhideWhenUsed/>
     <w:rsid w:val="009E3BB8"/>
@@ -17251,72 +18065,72 @@
   </w:style>
   <w:style w:type="character" w:customStyle="1" w:styleId="citation-27">
     <w:name w:val="citation-27"/>
-    <w:basedOn w:val="DefaultParagraphFont"/>
+    <w:basedOn w:val="Carpredefinitoparagrafo"/>
     <w:rsid w:val="002C31AD"/>
   </w:style>
   <w:style w:type="character" w:customStyle="1" w:styleId="citation-26">
     <w:name w:val="citation-26"/>
-    <w:basedOn w:val="DefaultParagraphFont"/>
+    <w:basedOn w:val="Carpredefinitoparagrafo"/>
     <w:rsid w:val="002C31AD"/>
   </w:style>
   <w:style w:type="character" w:customStyle="1" w:styleId="citation-25">
     <w:name w:val="citation-25"/>
-    <w:basedOn w:val="DefaultParagraphFont"/>
+    <w:basedOn w:val="Carpredefinitoparagrafo"/>
     <w:rsid w:val="002C31AD"/>
   </w:style>
   <w:style w:type="character" w:customStyle="1" w:styleId="citation-24">
     <w:name w:val="citation-24"/>
-    <w:basedOn w:val="DefaultParagraphFont"/>
+    <w:basedOn w:val="Carpredefinitoparagrafo"/>
     <w:rsid w:val="002C31AD"/>
   </w:style>
   <w:style w:type="character" w:customStyle="1" w:styleId="citation-23">
     <w:name w:val="citation-23"/>
-    <w:basedOn w:val="DefaultParagraphFont"/>
+    <w:basedOn w:val="Carpredefinitoparagrafo"/>
     <w:rsid w:val="002C31AD"/>
   </w:style>
   <w:style w:type="character" w:customStyle="1" w:styleId="citation-22">
     <w:name w:val="citation-22"/>
-    <w:basedOn w:val="DefaultParagraphFont"/>
+    <w:basedOn w:val="Carpredefinitoparagrafo"/>
     <w:rsid w:val="002C31AD"/>
   </w:style>
   <w:style w:type="character" w:customStyle="1" w:styleId="citation-21">
     <w:name w:val="citation-21"/>
-    <w:basedOn w:val="DefaultParagraphFont"/>
+    <w:basedOn w:val="Carpredefinitoparagrafo"/>
     <w:rsid w:val="002C31AD"/>
   </w:style>
   <w:style w:type="character" w:customStyle="1" w:styleId="citation-20">
     <w:name w:val="citation-20"/>
-    <w:basedOn w:val="DefaultParagraphFont"/>
+    <w:basedOn w:val="Carpredefinitoparagrafo"/>
     <w:rsid w:val="002C31AD"/>
   </w:style>
   <w:style w:type="character" w:customStyle="1" w:styleId="citation-19">
     <w:name w:val="citation-19"/>
-    <w:basedOn w:val="DefaultParagraphFont"/>
+    <w:basedOn w:val="Carpredefinitoparagrafo"/>
     <w:rsid w:val="002C31AD"/>
   </w:style>
   <w:style w:type="character" w:customStyle="1" w:styleId="citation-18">
     <w:name w:val="citation-18"/>
-    <w:basedOn w:val="DefaultParagraphFont"/>
+    <w:basedOn w:val="Carpredefinitoparagrafo"/>
     <w:rsid w:val="002C31AD"/>
   </w:style>
   <w:style w:type="character" w:customStyle="1" w:styleId="citation-17">
     <w:name w:val="citation-17"/>
-    <w:basedOn w:val="DefaultParagraphFont"/>
+    <w:basedOn w:val="Carpredefinitoparagrafo"/>
     <w:rsid w:val="002C31AD"/>
   </w:style>
   <w:style w:type="character" w:customStyle="1" w:styleId="citation-16">
     <w:name w:val="citation-16"/>
-    <w:basedOn w:val="DefaultParagraphFont"/>
+    <w:basedOn w:val="Carpredefinitoparagrafo"/>
     <w:rsid w:val="002C31AD"/>
   </w:style>
   <w:style w:type="character" w:customStyle="1" w:styleId="citation-15">
     <w:name w:val="citation-15"/>
-    <w:basedOn w:val="DefaultParagraphFont"/>
+    <w:basedOn w:val="Carpredefinitoparagrafo"/>
     <w:rsid w:val="002C31AD"/>
   </w:style>
-  <w:style w:type="character" w:styleId="HTMLCode">
+  <w:style w:type="character" w:styleId="CodiceHTML">
     <w:name w:val="HTML Code"/>
-    <w:basedOn w:val="DefaultParagraphFont"/>
+    <w:basedOn w:val="Carpredefinitoparagrafo"/>
     <w:uiPriority w:val="99"/>
     <w:semiHidden/>
     <w:unhideWhenUsed/>
@@ -17327,9 +18141,9 @@
       <w:szCs w:val="20"/>
     </w:rPr>
   </w:style>
-  <w:style w:type="character" w:styleId="CommentReference">
+  <w:style w:type="character" w:styleId="Rimandocommento">
     <w:name w:val="annotation reference"/>
-    <w:basedOn w:val="DefaultParagraphFont"/>
+    <w:basedOn w:val="Carpredefinitoparagrafo"/>
     <w:uiPriority w:val="99"/>
     <w:semiHidden/>
     <w:unhideWhenUsed/>
@@ -17339,10 +18153,10 @@
       <w:szCs w:val="16"/>
     </w:rPr>
   </w:style>
-  <w:style w:type="paragraph" w:styleId="CommentText">
+  <w:style w:type="paragraph" w:styleId="Testocommento">
     <w:name w:val="annotation text"/>
-    <w:basedOn w:val="Normal"/>
-    <w:link w:val="CommentTextChar"/>
+    <w:basedOn w:val="Normale"/>
+    <w:link w:val="TestocommentoCarattere"/>
     <w:uiPriority w:val="99"/>
     <w:unhideWhenUsed/>
     <w:rsid w:val="002667FD"/>
@@ -17351,10 +18165,10 @@
       <w:szCs w:val="20"/>
     </w:rPr>
   </w:style>
-  <w:style w:type="character" w:customStyle="1" w:styleId="CommentTextChar">
-    <w:name w:val="Comment Text Char"/>
-    <w:basedOn w:val="DefaultParagraphFont"/>
-    <w:link w:val="CommentText"/>
+  <w:style w:type="character" w:customStyle="1" w:styleId="TestocommentoCarattere">
+    <w:name w:val="Testo commento Carattere"/>
+    <w:basedOn w:val="Carpredefinitoparagrafo"/>
+    <w:link w:val="Testocommento"/>
     <w:uiPriority w:val="99"/>
     <w:rsid w:val="002667FD"/>
     <w:rPr>
@@ -17363,11 +18177,11 @@
       <w:szCs w:val="20"/>
     </w:rPr>
   </w:style>
-  <w:style w:type="paragraph" w:styleId="CommentSubject">
+  <w:style w:type="paragraph" w:styleId="Soggettocommento">
     <w:name w:val="annotation subject"/>
-    <w:basedOn w:val="CommentText"/>
-    <w:next w:val="CommentText"/>
-    <w:link w:val="CommentSubjectChar"/>
+    <w:basedOn w:val="Testocommento"/>
+    <w:next w:val="Testocommento"/>
+    <w:link w:val="SoggettocommentoCarattere"/>
     <w:uiPriority w:val="99"/>
     <w:semiHidden/>
     <w:unhideWhenUsed/>
@@ -17377,10 +18191,10 @@
       <w:bCs/>
     </w:rPr>
   </w:style>
-  <w:style w:type="character" w:customStyle="1" w:styleId="CommentSubjectChar">
-    <w:name w:val="Comment Subject Char"/>
-    <w:basedOn w:val="CommentTextChar"/>
-    <w:link w:val="CommentSubject"/>
+  <w:style w:type="character" w:customStyle="1" w:styleId="SoggettocommentoCarattere">
+    <w:name w:val="Soggetto commento Carattere"/>
+    <w:basedOn w:val="TestocommentoCarattere"/>
+    <w:link w:val="Soggettocommento"/>
     <w:uiPriority w:val="99"/>
     <w:semiHidden/>
     <w:rsid w:val="002667FD"/>
@@ -17394,12 +18208,12 @@
   </w:style>
   <w:style w:type="character" w:customStyle="1" w:styleId="citation-687">
     <w:name w:val="citation-687"/>
-    <w:basedOn w:val="DefaultParagraphFont"/>
+    <w:basedOn w:val="Carpredefinitoparagrafo"/>
     <w:rsid w:val="00B53C98"/>
   </w:style>
   <w:style w:type="character" w:customStyle="1" w:styleId="citation-686">
     <w:name w:val="citation-686"/>
-    <w:basedOn w:val="DefaultParagraphFont"/>
+    <w:basedOn w:val="Carpredefinitoparagrafo"/>
     <w:rsid w:val="00B53C98"/>
   </w:style>
 </w:styles>
@@ -17701,23 +18515,6 @@
 </file>
 
 <file path=customXml/item1.xml><?xml version="1.0" encoding="utf-8"?>
-<p:properties xmlns:p="http://schemas.microsoft.com/office/2006/metadata/properties" xmlns:xsi="http://www.w3.org/2001/XMLSchema-instance" xmlns:pc="http://schemas.microsoft.com/office/infopath/2007/PartnerControls">
-  <documentManagement>
-    <_activity xmlns="1682274c-17d2-4eb1-91bb-64e0444dc755" xsi:nil="true"/>
-  </documentManagement>
-</p:properties>
-</file>
-
-<file path=customXml/item2.xml><?xml version="1.0" encoding="utf-8"?>
-<?mso-contentType ?>
-<FormTemplates xmlns="http://schemas.microsoft.com/sharepoint/v3/contenttype/forms">
-  <Display>DocumentLibraryForm</Display>
-  <Edit>DocumentLibraryForm</Edit>
-  <New>DocumentLibraryForm</New>
-</FormTemplates>
-</file>
-
-<file path=customXml/item3.xml><?xml version="1.0" encoding="utf-8"?>
 <ct:contentTypeSchema xmlns:ct="http://schemas.microsoft.com/office/2006/metadata/contentType" xmlns:ma="http://schemas.microsoft.com/office/2006/metadata/properties/metaAttributes" ct:_="" ma:_="" ma:contentTypeName="Documento" ma:contentTypeID="0x010100483500D60DFCF744AD254A79C2671EC4" ma:contentTypeVersion="5" ma:contentTypeDescription="Creare un nuovo documento." ma:contentTypeScope="" ma:versionID="7b665a2209f67cd04619df273567bc5b">
   <xsd:schema xmlns:xsd="http://www.w3.org/2001/XMLSchema" xmlns:xs="http://www.w3.org/2001/XMLSchema" xmlns:p="http://schemas.microsoft.com/office/2006/metadata/properties" xmlns:ns3="1682274c-17d2-4eb1-91bb-64e0444dc755" targetNamespace="http://schemas.microsoft.com/office/2006/metadata/properties" ma:root="true" ma:fieldsID="09422ce98116468340c6fac1dc03f610" ns3:_="">
     <xsd:import namespace="1682274c-17d2-4eb1-91bb-64e0444dc755"/>
@@ -17867,25 +18664,24 @@
 </ct:contentTypeSchema>
 </file>
 
-<file path=customXml/itemProps1.xml><?xml version="1.0" encoding="utf-8"?>
-<ds:datastoreItem xmlns:ds="http://schemas.openxmlformats.org/officeDocument/2006/customXml" ds:itemID="{2B0A1CF6-C588-4E49-9D26-36301E052649}">
-  <ds:schemaRefs>
-    <ds:schemaRef ds:uri="http://schemas.microsoft.com/office/2006/metadata/properties"/>
-    <ds:schemaRef ds:uri="http://schemas.microsoft.com/office/infopath/2007/PartnerControls"/>
-    <ds:schemaRef ds:uri="1682274c-17d2-4eb1-91bb-64e0444dc755"/>
-  </ds:schemaRefs>
-</ds:datastoreItem>
+<file path=customXml/item2.xml><?xml version="1.0" encoding="utf-8"?>
+<?mso-contentType ?>
+<FormTemplates xmlns="http://schemas.microsoft.com/sharepoint/v3/contenttype/forms">
+  <Display>DocumentLibraryForm</Display>
+  <Edit>DocumentLibraryForm</Edit>
+  <New>DocumentLibraryForm</New>
+</FormTemplates>
 </file>
 
-<file path=customXml/itemProps2.xml><?xml version="1.0" encoding="utf-8"?>
-<ds:datastoreItem xmlns:ds="http://schemas.openxmlformats.org/officeDocument/2006/customXml" ds:itemID="{82EED737-999D-430D-BB13-B55BCBEF8CD3}">
-  <ds:schemaRefs>
-    <ds:schemaRef ds:uri="http://schemas.microsoft.com/sharepoint/v3/contenttype/forms"/>
-  </ds:schemaRefs>
-</ds:datastoreItem>
+<file path=customXml/item3.xml><?xml version="1.0" encoding="utf-8"?>
+<p:properties xmlns:p="http://schemas.microsoft.com/office/2006/metadata/properties" xmlns:xsi="http://www.w3.org/2001/XMLSchema-instance" xmlns:pc="http://schemas.microsoft.com/office/infopath/2007/PartnerControls">
+  <documentManagement>
+    <_activity xmlns="1682274c-17d2-4eb1-91bb-64e0444dc755" xsi:nil="true"/>
+  </documentManagement>
+</p:properties>
 </file>
 
-<file path=customXml/itemProps3.xml><?xml version="1.0" encoding="utf-8"?>
+<file path=customXml/itemProps1.xml><?xml version="1.0" encoding="utf-8"?>
 <ds:datastoreItem xmlns:ds="http://schemas.openxmlformats.org/officeDocument/2006/customXml" ds:itemID="{E3DC2D59-DB5B-4EAF-BF4B-86942C28552E}">
   <ds:schemaRefs>
     <ds:schemaRef ds:uri="http://schemas.microsoft.com/office/2006/metadata/contentType"/>
@@ -17901,4 +18697,22 @@
     <ds:schemaRef ds:uri="http://schemas.microsoft.com/internal/obd"/>
   </ds:schemaRefs>
 </ds:datastoreItem>
+</file>
+
+<file path=customXml/itemProps2.xml><?xml version="1.0" encoding="utf-8"?>
+<ds:datastoreItem xmlns:ds="http://schemas.openxmlformats.org/officeDocument/2006/customXml" ds:itemID="{82EED737-999D-430D-BB13-B55BCBEF8CD3}">
+  <ds:schemaRefs>
+    <ds:schemaRef ds:uri="http://schemas.microsoft.com/sharepoint/v3/contenttype/forms"/>
+  </ds:schemaRefs>
+</ds:datastoreItem>
+</file>
+
+<file path=customXml/itemProps3.xml><?xml version="1.0" encoding="utf-8"?>
+<ds:datastoreItem xmlns:ds="http://schemas.openxmlformats.org/officeDocument/2006/customXml" ds:itemID="{2B0A1CF6-C588-4E49-9D26-36301E052649}">
+  <ds:schemaRefs>
+    <ds:schemaRef ds:uri="http://schemas.microsoft.com/office/2006/metadata/properties"/>
+    <ds:schemaRef ds:uri="http://schemas.microsoft.com/office/infopath/2007/PartnerControls"/>
+    <ds:schemaRef ds:uri="1682274c-17d2-4eb1-91bb-64e0444dc755"/>
+  </ds:schemaRefs>
+</ds:datastoreItem>
 </file>
</xml_diff>

<commit_message>
Aggiunta pausa e storyboard
</commit_message>
<xml_diff>
--- a/doc/Documentazione BariGo (1).docx
+++ b/doc/Documentazione BariGo (1).docx
@@ -101,7 +101,7 @@
                               <w:t>Versione documento 1.</w:t>
                             </w:r>
                             <w:r>
-                              <w:t>2</w:t>
+                              <w:t>5</w:t>
                             </w:r>
                           </w:p>
                           <w:p>
@@ -218,7 +218,7 @@
                         <w:t>Versione documento 1.</w:t>
                       </w:r>
                       <w:r>
-                        <w:t>2</w:t>
+                        <w:t>5</w:t>
                       </w:r>
                     </w:p>
                     <w:p>
@@ -7815,7 +7815,7 @@
           <w:noProof/>
         </w:rPr>
         <w:drawing>
-          <wp:inline distT="0" distB="0" distL="0" distR="0" wp14:anchorId="2D69741C" wp14:editId="2151BEB6">
+          <wp:inline distT="0" distB="0" distL="0" distR="0" wp14:anchorId="2D69741C" wp14:editId="77AF641F">
             <wp:extent cx="6116320" cy="7671526"/>
             <wp:effectExtent l="0" t="0" r="0" b="0"/>
             <wp:docPr id="1471364459" name="Immagine 9"/>
@@ -7867,47 +7867,430 @@
       </w:r>
     </w:p>
     <w:p>
+      <w:r>
+        <w:br w:type="page"/>
+      </w:r>
+    </w:p>
+    <w:p>
+      <w:pPr>
+        <w:pStyle w:val="Paragrafoelenco"/>
+        <w:numPr>
+          <w:ilvl w:val="0"/>
+          <w:numId w:val="27"/>
+        </w:numPr>
+      </w:pPr>
+      <w:r>
+        <w:lastRenderedPageBreak/>
+        <w:t xml:space="preserve">Flowchart di </w:t>
+      </w:r>
+      <w:proofErr w:type="gramStart"/>
+      <w:r>
+        <w:t>2</w:t>
+      </w:r>
+      <w:r>
+        <w:t>°</w:t>
+      </w:r>
+      <w:proofErr w:type="gramEnd"/>
+      <w:r>
+        <w:t xml:space="preserve"> livello</w:t>
+      </w:r>
+      <w:r>
+        <w:t>,</w:t>
+      </w:r>
+      <w:r>
+        <w:t xml:space="preserve"> </w:t>
+      </w:r>
+      <w:r>
+        <w:rPr>
+          <w:b/>
+          <w:bCs/>
+        </w:rPr>
+        <w:t xml:space="preserve">Logica </w:t>
+      </w:r>
+      <w:r>
+        <w:rPr>
+          <w:b/>
+          <w:bCs/>
+        </w:rPr>
+        <w:t>Menu di Pausa</w:t>
+      </w:r>
+      <w:r>
+        <w:t>:</w:t>
+      </w:r>
+      <w:r>
+        <w:br/>
+      </w:r>
+    </w:p>
+    <w:p>
+      <w:r>
+        <w:rPr>
+          <w:noProof/>
+        </w:rPr>
+        <w:drawing>
+          <wp:inline distT="0" distB="0" distL="0" distR="0" wp14:anchorId="6AE0EECF" wp14:editId="05D57979">
+            <wp:extent cx="6116212" cy="5145858"/>
+            <wp:effectExtent l="0" t="0" r="0" b="0"/>
+            <wp:docPr id="2118772023" name="Immagine 9"/>
+            <wp:cNvGraphicFramePr>
+              <a:graphicFrameLocks xmlns:a="http://schemas.openxmlformats.org/drawingml/2006/main" noChangeAspect="1"/>
+            </wp:cNvGraphicFramePr>
+            <a:graphic xmlns:a="http://schemas.openxmlformats.org/drawingml/2006/main">
+              <a:graphicData uri="http://schemas.openxmlformats.org/drawingml/2006/picture">
+                <pic:pic xmlns:pic="http://schemas.openxmlformats.org/drawingml/2006/picture">
+                  <pic:nvPicPr>
+                    <pic:cNvPr id="2118772023" name="Immagine 2118772023"/>
+                    <pic:cNvPicPr/>
+                  </pic:nvPicPr>
+                  <pic:blipFill rotWithShape="1">
+                    <a:blip r:embed="rId17">
+                      <a:extLst>
+                        <a:ext uri="{28A0092B-C50C-407E-A947-70E740481C1C}">
+                          <a14:useLocalDpi xmlns:a14="http://schemas.microsoft.com/office/drawing/2010/main" val="0"/>
+                        </a:ext>
+                      </a:extLst>
+                    </a:blip>
+                    <a:srcRect t="6432"/>
+                    <a:stretch>
+                      <a:fillRect/>
+                    </a:stretch>
+                  </pic:blipFill>
+                  <pic:spPr bwMode="auto">
+                    <a:xfrm>
+                      <a:off x="0" y="0"/>
+                      <a:ext cx="6116320" cy="5145949"/>
+                    </a:xfrm>
+                    <a:prstGeom prst="rect">
+                      <a:avLst/>
+                    </a:prstGeom>
+                    <a:ln>
+                      <a:noFill/>
+                    </a:ln>
+                    <a:extLst>
+                      <a:ext uri="{53640926-AAD7-44D8-BBD7-CCE9431645EC}">
+                        <a14:shadowObscured xmlns:a14="http://schemas.microsoft.com/office/drawing/2010/main"/>
+                      </a:ext>
+                    </a:extLst>
+                  </pic:spPr>
+                </pic:pic>
+              </a:graphicData>
+            </a:graphic>
+          </wp:inline>
+        </w:drawing>
+      </w:r>
+    </w:p>
+    <w:p>
       <w:pPr>
         <w:pStyle w:val="Titolo3"/>
-        <w:rPr>
-          <w:lang w:val="en-US"/>
-        </w:rPr>
       </w:pPr>
       <w:bookmarkStart w:id="15" w:name="_Toc41400391"/>
       <w:r>
-        <w:rPr>
-          <w:lang w:val="en-US"/>
-        </w:rPr>
         <w:lastRenderedPageBreak/>
         <w:t>Storyboard</w:t>
       </w:r>
       <w:bookmarkEnd w:id="15"/>
     </w:p>
     <w:p>
-      <w:pPr>
-        <w:rPr>
-          <w:lang w:val="en-US"/>
-        </w:rPr>
-      </w:pPr>
-      <w:r>
-        <w:rPr>
-          <w:lang w:val="en-US"/>
-        </w:rPr>
+      <w:r>
+        <w:rPr>
+          <w:noProof/>
+        </w:rPr>
+        <w:drawing>
+          <wp:inline distT="0" distB="0" distL="0" distR="0" wp14:anchorId="0CDD2137" wp14:editId="18C148D1">
+            <wp:extent cx="6116320" cy="3319780"/>
+            <wp:effectExtent l="0" t="0" r="0" b="0"/>
+            <wp:docPr id="8968053" name="Immagine 5"/>
+            <wp:cNvGraphicFramePr>
+              <a:graphicFrameLocks xmlns:a="http://schemas.openxmlformats.org/drawingml/2006/main" noChangeAspect="1"/>
+            </wp:cNvGraphicFramePr>
+            <a:graphic xmlns:a="http://schemas.openxmlformats.org/drawingml/2006/main">
+              <a:graphicData uri="http://schemas.openxmlformats.org/drawingml/2006/picture">
+                <pic:pic xmlns:pic="http://schemas.openxmlformats.org/drawingml/2006/picture">
+                  <pic:nvPicPr>
+                    <pic:cNvPr id="8968053" name="Immagine 8968053"/>
+                    <pic:cNvPicPr/>
+                  </pic:nvPicPr>
+                  <pic:blipFill>
+                    <a:blip r:embed="rId18" cstate="print">
+                      <a:extLst>
+                        <a:ext uri="{28A0092B-C50C-407E-A947-70E740481C1C}">
+                          <a14:useLocalDpi xmlns:a14="http://schemas.microsoft.com/office/drawing/2010/main" val="0"/>
+                        </a:ext>
+                      </a:extLst>
+                    </a:blip>
+                    <a:stretch>
+                      <a:fillRect/>
+                    </a:stretch>
+                  </pic:blipFill>
+                  <pic:spPr>
+                    <a:xfrm>
+                      <a:off x="0" y="0"/>
+                      <a:ext cx="6116320" cy="3319780"/>
+                    </a:xfrm>
+                    <a:prstGeom prst="rect">
+                      <a:avLst/>
+                    </a:prstGeom>
+                  </pic:spPr>
+                </pic:pic>
+              </a:graphicData>
+            </a:graphic>
+          </wp:inline>
+        </w:drawing>
+      </w:r>
+      <w:r>
+        <w:rPr>
+          <w:noProof/>
+        </w:rPr>
+        <w:drawing>
+          <wp:inline distT="0" distB="0" distL="0" distR="0" wp14:anchorId="64976DA4" wp14:editId="59367206">
+            <wp:extent cx="6116320" cy="3227070"/>
+            <wp:effectExtent l="0" t="0" r="0" b="0"/>
+            <wp:docPr id="1165822639" name="Immagine 4"/>
+            <wp:cNvGraphicFramePr>
+              <a:graphicFrameLocks xmlns:a="http://schemas.openxmlformats.org/drawingml/2006/main" noChangeAspect="1"/>
+            </wp:cNvGraphicFramePr>
+            <a:graphic xmlns:a="http://schemas.openxmlformats.org/drawingml/2006/main">
+              <a:graphicData uri="http://schemas.openxmlformats.org/drawingml/2006/picture">
+                <pic:pic xmlns:pic="http://schemas.openxmlformats.org/drawingml/2006/picture">
+                  <pic:nvPicPr>
+                    <pic:cNvPr id="1165822639" name="Immagine 1165822639"/>
+                    <pic:cNvPicPr/>
+                  </pic:nvPicPr>
+                  <pic:blipFill>
+                    <a:blip r:embed="rId19" cstate="print">
+                      <a:extLst>
+                        <a:ext uri="{28A0092B-C50C-407E-A947-70E740481C1C}">
+                          <a14:useLocalDpi xmlns:a14="http://schemas.microsoft.com/office/drawing/2010/main" val="0"/>
+                        </a:ext>
+                      </a:extLst>
+                    </a:blip>
+                    <a:stretch>
+                      <a:fillRect/>
+                    </a:stretch>
+                  </pic:blipFill>
+                  <pic:spPr>
+                    <a:xfrm>
+                      <a:off x="0" y="0"/>
+                      <a:ext cx="6116320" cy="3227070"/>
+                    </a:xfrm>
+                    <a:prstGeom prst="rect">
+                      <a:avLst/>
+                    </a:prstGeom>
+                  </pic:spPr>
+                </pic:pic>
+              </a:graphicData>
+            </a:graphic>
+          </wp:inline>
+        </w:drawing>
+      </w:r>
+      <w:r>
+        <w:rPr>
+          <w:noProof/>
+        </w:rPr>
+        <w:lastRenderedPageBreak/>
+        <w:drawing>
+          <wp:inline distT="0" distB="0" distL="0" distR="0" wp14:anchorId="0EEF9B4A" wp14:editId="51AF9D68">
+            <wp:extent cx="6116320" cy="2788285"/>
+            <wp:effectExtent l="0" t="0" r="0" b="0"/>
+            <wp:docPr id="206215769" name="Immagine 3"/>
+            <wp:cNvGraphicFramePr>
+              <a:graphicFrameLocks xmlns:a="http://schemas.openxmlformats.org/drawingml/2006/main" noChangeAspect="1"/>
+            </wp:cNvGraphicFramePr>
+            <a:graphic xmlns:a="http://schemas.openxmlformats.org/drawingml/2006/main">
+              <a:graphicData uri="http://schemas.openxmlformats.org/drawingml/2006/picture">
+                <pic:pic xmlns:pic="http://schemas.openxmlformats.org/drawingml/2006/picture">
+                  <pic:nvPicPr>
+                    <pic:cNvPr id="206215769" name="Immagine 206215769"/>
+                    <pic:cNvPicPr/>
+                  </pic:nvPicPr>
+                  <pic:blipFill>
+                    <a:blip r:embed="rId20" cstate="print">
+                      <a:extLst>
+                        <a:ext uri="{28A0092B-C50C-407E-A947-70E740481C1C}">
+                          <a14:useLocalDpi xmlns:a14="http://schemas.microsoft.com/office/drawing/2010/main" val="0"/>
+                        </a:ext>
+                      </a:extLst>
+                    </a:blip>
+                    <a:stretch>
+                      <a:fillRect/>
+                    </a:stretch>
+                  </pic:blipFill>
+                  <pic:spPr>
+                    <a:xfrm>
+                      <a:off x="0" y="0"/>
+                      <a:ext cx="6116320" cy="2788285"/>
+                    </a:xfrm>
+                    <a:prstGeom prst="rect">
+                      <a:avLst/>
+                    </a:prstGeom>
+                  </pic:spPr>
+                </pic:pic>
+              </a:graphicData>
+            </a:graphic>
+          </wp:inline>
+        </w:drawing>
+      </w:r>
+      <w:r>
+        <w:rPr>
+          <w:noProof/>
+        </w:rPr>
+        <w:drawing>
+          <wp:inline distT="0" distB="0" distL="0" distR="0" wp14:anchorId="403E2D88" wp14:editId="024FBD72">
+            <wp:extent cx="6116320" cy="2970398"/>
+            <wp:effectExtent l="0" t="0" r="0" b="1905"/>
+            <wp:docPr id="1278342514" name="Immagine 6"/>
+            <wp:cNvGraphicFramePr>
+              <a:graphicFrameLocks xmlns:a="http://schemas.openxmlformats.org/drawingml/2006/main" noChangeAspect="1"/>
+            </wp:cNvGraphicFramePr>
+            <a:graphic xmlns:a="http://schemas.openxmlformats.org/drawingml/2006/main">
+              <a:graphicData uri="http://schemas.openxmlformats.org/drawingml/2006/picture">
+                <pic:pic xmlns:pic="http://schemas.openxmlformats.org/drawingml/2006/picture">
+                  <pic:nvPicPr>
+                    <pic:cNvPr id="1278342514" name="Immagine 6"/>
+                    <pic:cNvPicPr/>
+                  </pic:nvPicPr>
+                  <pic:blipFill>
+                    <a:blip r:embed="rId21" cstate="print">
+                      <a:extLst>
+                        <a:ext uri="{28A0092B-C50C-407E-A947-70E740481C1C}">
+                          <a14:useLocalDpi xmlns:a14="http://schemas.microsoft.com/office/drawing/2010/main" val="0"/>
+                        </a:ext>
+                      </a:extLst>
+                    </a:blip>
+                    <a:stretch>
+                      <a:fillRect/>
+                    </a:stretch>
+                  </pic:blipFill>
+                  <pic:spPr>
+                    <a:xfrm>
+                      <a:off x="0" y="0"/>
+                      <a:ext cx="6116320" cy="2970398"/>
+                    </a:xfrm>
+                    <a:prstGeom prst="rect">
+                      <a:avLst/>
+                    </a:prstGeom>
+                  </pic:spPr>
+                </pic:pic>
+              </a:graphicData>
+            </a:graphic>
+          </wp:inline>
+        </w:drawing>
+      </w:r>
+      <w:r>
+        <w:rPr>
+          <w:noProof/>
+        </w:rPr>
+        <w:lastRenderedPageBreak/>
+        <w:drawing>
+          <wp:inline distT="0" distB="0" distL="0" distR="0" wp14:anchorId="54E8B55A" wp14:editId="2722EFA1">
+            <wp:extent cx="6116320" cy="3162620"/>
+            <wp:effectExtent l="0" t="0" r="0" b="0"/>
+            <wp:docPr id="1327234333" name="Immagine 7"/>
+            <wp:cNvGraphicFramePr>
+              <a:graphicFrameLocks xmlns:a="http://schemas.openxmlformats.org/drawingml/2006/main" noChangeAspect="1"/>
+            </wp:cNvGraphicFramePr>
+            <a:graphic xmlns:a="http://schemas.openxmlformats.org/drawingml/2006/main">
+              <a:graphicData uri="http://schemas.openxmlformats.org/drawingml/2006/picture">
+                <pic:pic xmlns:pic="http://schemas.openxmlformats.org/drawingml/2006/picture">
+                  <pic:nvPicPr>
+                    <pic:cNvPr id="1327234333" name="Immagine 7"/>
+                    <pic:cNvPicPr/>
+                  </pic:nvPicPr>
+                  <pic:blipFill>
+                    <a:blip r:embed="rId22" cstate="print">
+                      <a:extLst>
+                        <a:ext uri="{28A0092B-C50C-407E-A947-70E740481C1C}">
+                          <a14:useLocalDpi xmlns:a14="http://schemas.microsoft.com/office/drawing/2010/main" val="0"/>
+                        </a:ext>
+                      </a:extLst>
+                    </a:blip>
+                    <a:stretch>
+                      <a:fillRect/>
+                    </a:stretch>
+                  </pic:blipFill>
+                  <pic:spPr>
+                    <a:xfrm>
+                      <a:off x="0" y="0"/>
+                      <a:ext cx="6116320" cy="3162620"/>
+                    </a:xfrm>
+                    <a:prstGeom prst="rect">
+                      <a:avLst/>
+                    </a:prstGeom>
+                  </pic:spPr>
+                </pic:pic>
+              </a:graphicData>
+            </a:graphic>
+          </wp:inline>
+        </w:drawing>
+      </w:r>
+    </w:p>
+    <w:p>
+      <w:r>
+        <w:rPr>
+          <w:noProof/>
+        </w:rPr>
+        <w:drawing>
+          <wp:inline distT="0" distB="0" distL="0" distR="0" wp14:anchorId="0F712486" wp14:editId="523B0387">
+            <wp:extent cx="6116320" cy="3368675"/>
+            <wp:effectExtent l="0" t="0" r="0" b="3175"/>
+            <wp:docPr id="1822982663" name="Immagine 8"/>
+            <wp:cNvGraphicFramePr>
+              <a:graphicFrameLocks xmlns:a="http://schemas.openxmlformats.org/drawingml/2006/main" noChangeAspect="1"/>
+            </wp:cNvGraphicFramePr>
+            <a:graphic xmlns:a="http://schemas.openxmlformats.org/drawingml/2006/main">
+              <a:graphicData uri="http://schemas.openxmlformats.org/drawingml/2006/picture">
+                <pic:pic xmlns:pic="http://schemas.openxmlformats.org/drawingml/2006/picture">
+                  <pic:nvPicPr>
+                    <pic:cNvPr id="1822982663" name="Immagine 1822982663"/>
+                    <pic:cNvPicPr/>
+                  </pic:nvPicPr>
+                  <pic:blipFill>
+                    <a:blip r:embed="rId23" cstate="print">
+                      <a:extLst>
+                        <a:ext uri="{28A0092B-C50C-407E-A947-70E740481C1C}">
+                          <a14:useLocalDpi xmlns:a14="http://schemas.microsoft.com/office/drawing/2010/main" val="0"/>
+                        </a:ext>
+                      </a:extLst>
+                    </a:blip>
+                    <a:stretch>
+                      <a:fillRect/>
+                    </a:stretch>
+                  </pic:blipFill>
+                  <pic:spPr>
+                    <a:xfrm>
+                      <a:off x="0" y="0"/>
+                      <a:ext cx="6116320" cy="3368675"/>
+                    </a:xfrm>
+                    <a:prstGeom prst="rect">
+                      <a:avLst/>
+                    </a:prstGeom>
+                  </pic:spPr>
+                </pic:pic>
+              </a:graphicData>
+            </a:graphic>
+          </wp:inline>
+        </w:drawing>
+      </w:r>
+    </w:p>
+    <w:p>
+      <w:pPr>
+        <w:rPr>
+          <w:rFonts w:eastAsiaTheme="majorEastAsia" w:cstheme="majorBidi"/>
+          <w:b/>
+          <w:color w:val="2F5496" w:themeColor="accent1" w:themeShade="BF"/>
+          <w:sz w:val="40"/>
+          <w:szCs w:val="32"/>
+        </w:rPr>
+      </w:pPr>
+      <w:bookmarkStart w:id="16" w:name="_Toc41400392"/>
+      <w:r>
         <w:br w:type="page"/>
       </w:r>
     </w:p>
     <w:p>
       <w:pPr>
         <w:pStyle w:val="Titolo1"/>
-        <w:rPr>
-          <w:lang w:val="en-US"/>
-        </w:rPr>
-      </w:pPr>
-      <w:bookmarkStart w:id="16" w:name="_Toc41400392"/>
-      <w:r>
-        <w:rPr>
-          <w:lang w:val="en-US"/>
-        </w:rPr>
+      </w:pPr>
+      <w:r>
         <w:lastRenderedPageBreak/>
         <w:t>Test</w:t>
       </w:r>
@@ -7916,205 +8299,59 @@
     <w:p>
       <w:pPr>
         <w:pStyle w:val="Titolo2"/>
-        <w:rPr>
-          <w:lang w:val="en-US"/>
-        </w:rPr>
       </w:pPr>
       <w:bookmarkStart w:id="17" w:name="_Toc41400393"/>
       <w:r>
-        <w:rPr>
-          <w:lang w:val="en-US"/>
-        </w:rPr>
         <w:t>Alpha test</w:t>
       </w:r>
       <w:bookmarkEnd w:id="17"/>
     </w:p>
     <w:p>
-      <w:pPr>
-        <w:rPr>
-          <w:lang w:val="en-US"/>
-        </w:rPr>
-      </w:pPr>
-      <w:r>
-        <w:rPr>
-          <w:lang w:val="en-US"/>
-        </w:rPr>
-        <w:t xml:space="preserve">Test </w:t>
-      </w:r>
-      <w:proofErr w:type="spellStart"/>
-      <w:r>
-        <w:rPr>
-          <w:lang w:val="en-US"/>
-        </w:rPr>
-        <w:t>effettuato</w:t>
-      </w:r>
-      <w:proofErr w:type="spellEnd"/>
-      <w:r>
-        <w:rPr>
-          <w:lang w:val="en-US"/>
-        </w:rPr>
-        <w:t xml:space="preserve"> dal </w:t>
-      </w:r>
-      <w:proofErr w:type="spellStart"/>
-      <w:r>
-        <w:rPr>
-          <w:lang w:val="en-US"/>
-        </w:rPr>
-        <w:t>gruppo</w:t>
-      </w:r>
-      <w:proofErr w:type="spellEnd"/>
-      <w:r>
-        <w:rPr>
-          <w:lang w:val="en-US"/>
-        </w:rPr>
-        <w:t xml:space="preserve"> di </w:t>
-      </w:r>
-      <w:proofErr w:type="spellStart"/>
-      <w:r>
-        <w:rPr>
-          <w:lang w:val="en-US"/>
-        </w:rPr>
-        <w:t>sviluppo</w:t>
-      </w:r>
-      <w:proofErr w:type="spellEnd"/>
+      <w:r>
+        <w:t>Test effettuato dal gruppo di sviluppo</w:t>
+      </w:r>
     </w:p>
     <w:p>
       <w:pPr>
         <w:pStyle w:val="Titolo3"/>
-        <w:rPr>
-          <w:lang w:val="en-US"/>
-        </w:rPr>
       </w:pPr>
       <w:bookmarkStart w:id="18" w:name="_Toc41400394"/>
       <w:r>
-        <w:rPr>
-          <w:lang w:val="en-US"/>
-        </w:rPr>
-        <w:t xml:space="preserve">Test </w:t>
-      </w:r>
-      <w:proofErr w:type="spellStart"/>
-      <w:r>
-        <w:rPr>
-          <w:lang w:val="en-US"/>
-        </w:rPr>
-        <w:t>funzionale</w:t>
+        <w:t>Test funzionale</w:t>
       </w:r>
       <w:bookmarkEnd w:id="18"/>
-      <w:proofErr w:type="spellEnd"/>
     </w:p>
     <w:p>
       <w:pPr>
         <w:pStyle w:val="Titolo3"/>
-        <w:rPr>
-          <w:lang w:val="en-US"/>
-        </w:rPr>
       </w:pPr>
       <w:bookmarkStart w:id="19" w:name="_Toc41400395"/>
       <w:r>
-        <w:rPr>
-          <w:lang w:val="en-US"/>
-        </w:rPr>
-        <w:t xml:space="preserve">Test </w:t>
-      </w:r>
-      <w:proofErr w:type="spellStart"/>
-      <w:r>
-        <w:rPr>
-          <w:lang w:val="en-US"/>
-        </w:rPr>
-        <w:t>strutturale</w:t>
+        <w:t>Test strutturale</w:t>
       </w:r>
       <w:bookmarkEnd w:id="19"/>
-      <w:proofErr w:type="spellEnd"/>
-    </w:p>
-    <w:p>
-      <w:pPr>
-        <w:rPr>
-          <w:lang w:val="en-US"/>
-        </w:rPr>
-      </w:pPr>
-    </w:p>
+    </w:p>
+    <w:p/>
     <w:p>
       <w:pPr>
         <w:pStyle w:val="Titolo2"/>
-        <w:rPr>
-          <w:lang w:val="en-US"/>
-        </w:rPr>
       </w:pPr>
       <w:bookmarkStart w:id="20" w:name="_Toc41400396"/>
       <w:r>
-        <w:rPr>
-          <w:lang w:val="en-US"/>
-        </w:rPr>
         <w:t>Beta test</w:t>
       </w:r>
       <w:bookmarkEnd w:id="20"/>
     </w:p>
     <w:p>
-      <w:pPr>
-        <w:rPr>
-          <w:lang w:val="en-US"/>
-        </w:rPr>
-      </w:pPr>
-      <w:r>
-        <w:rPr>
-          <w:lang w:val="en-US"/>
-        </w:rPr>
-        <w:t xml:space="preserve">Test con </w:t>
-      </w:r>
-      <w:proofErr w:type="spellStart"/>
-      <w:r>
-        <w:rPr>
-          <w:lang w:val="en-US"/>
-        </w:rPr>
-        <w:t>gli</w:t>
-      </w:r>
-      <w:proofErr w:type="spellEnd"/>
-      <w:r>
-        <w:rPr>
-          <w:lang w:val="en-US"/>
-        </w:rPr>
-        <w:t xml:space="preserve"> </w:t>
-      </w:r>
-      <w:proofErr w:type="spellStart"/>
-      <w:r>
-        <w:rPr>
-          <w:lang w:val="en-US"/>
-        </w:rPr>
-        <w:t>utenti</w:t>
-      </w:r>
-      <w:proofErr w:type="spellEnd"/>
-    </w:p>
-    <w:p>
-      <w:pPr>
-        <w:rPr>
-          <w:lang w:val="en-US"/>
-        </w:rPr>
-      </w:pPr>
-    </w:p>
-    <w:p>
-      <w:pPr>
-        <w:rPr>
-          <w:lang w:val="en-US"/>
-        </w:rPr>
-      </w:pPr>
-    </w:p>
-    <w:p>
-      <w:pPr>
-        <w:rPr>
-          <w:lang w:val="en-US"/>
-        </w:rPr>
-      </w:pPr>
-    </w:p>
-    <w:p>
-      <w:pPr>
-        <w:rPr>
-          <w:lang w:val="en-US"/>
-        </w:rPr>
-      </w:pPr>
-      <w:r>
-        <w:rPr>
-          <w:lang w:val="en-US"/>
-        </w:rPr>
+      <w:r>
+        <w:t>Test con gli utenti</w:t>
+      </w:r>
+    </w:p>
+    <w:p/>
+    <w:p/>
+    <w:p/>
+    <w:p>
+      <w:r>
         <w:br w:type="page"/>
       </w:r>
     </w:p>
@@ -12892,9 +13129,9 @@
     </w:p>
     <w:p/>
     <w:sectPr>
-      <w:headerReference w:type="default" r:id="rId17"/>
-      <w:footerReference w:type="even" r:id="rId18"/>
-      <w:footerReference w:type="default" r:id="rId19"/>
+      <w:headerReference w:type="default" r:id="rId24"/>
+      <w:footerReference w:type="even" r:id="rId25"/>
+      <w:footerReference w:type="default" r:id="rId26"/>
       <w:pgSz w:w="11900" w:h="16840"/>
       <w:pgMar w:top="2131" w:right="1134" w:bottom="1134" w:left="1134" w:header="708" w:footer="708" w:gutter="0"/>
       <w:cols w:space="708"/>
@@ -14037,7 +14274,7 @@
   <w:abstractNum w:abstractNumId="5" w15:restartNumberingAfterBreak="0">
     <w:nsid w:val="151629A9"/>
     <w:multiLevelType w:val="hybridMultilevel"/>
-    <w:tmpl w:val="3D98544C"/>
+    <w:tmpl w:val="D61455C0"/>
     <w:lvl w:ilvl="0" w:tplc="08090001">
       <w:start w:val="1"/>
       <w:numFmt w:val="bullet"/>
@@ -18515,6 +18752,15 @@
 </file>
 
 <file path=customXml/item1.xml><?xml version="1.0" encoding="utf-8"?>
+<?mso-contentType ?>
+<FormTemplates xmlns="http://schemas.microsoft.com/sharepoint/v3/contenttype/forms">
+  <Display>DocumentLibraryForm</Display>
+  <Edit>DocumentLibraryForm</Edit>
+  <New>DocumentLibraryForm</New>
+</FormTemplates>
+</file>
+
+<file path=customXml/item2.xml><?xml version="1.0" encoding="utf-8"?>
 <ct:contentTypeSchema xmlns:ct="http://schemas.microsoft.com/office/2006/metadata/contentType" xmlns:ma="http://schemas.microsoft.com/office/2006/metadata/properties/metaAttributes" ct:_="" ma:_="" ma:contentTypeName="Documento" ma:contentTypeID="0x010100483500D60DFCF744AD254A79C2671EC4" ma:contentTypeVersion="5" ma:contentTypeDescription="Creare un nuovo documento." ma:contentTypeScope="" ma:versionID="7b665a2209f67cd04619df273567bc5b">
   <xsd:schema xmlns:xsd="http://www.w3.org/2001/XMLSchema" xmlns:xs="http://www.w3.org/2001/XMLSchema" xmlns:p="http://schemas.microsoft.com/office/2006/metadata/properties" xmlns:ns3="1682274c-17d2-4eb1-91bb-64e0444dc755" targetNamespace="http://schemas.microsoft.com/office/2006/metadata/properties" ma:root="true" ma:fieldsID="09422ce98116468340c6fac1dc03f610" ns3:_="">
     <xsd:import namespace="1682274c-17d2-4eb1-91bb-64e0444dc755"/>
@@ -18664,15 +18910,6 @@
 </ct:contentTypeSchema>
 </file>
 
-<file path=customXml/item2.xml><?xml version="1.0" encoding="utf-8"?>
-<?mso-contentType ?>
-<FormTemplates xmlns="http://schemas.microsoft.com/sharepoint/v3/contenttype/forms">
-  <Display>DocumentLibraryForm</Display>
-  <Edit>DocumentLibraryForm</Edit>
-  <New>DocumentLibraryForm</New>
-</FormTemplates>
-</file>
-
 <file path=customXml/item3.xml><?xml version="1.0" encoding="utf-8"?>
 <p:properties xmlns:p="http://schemas.microsoft.com/office/2006/metadata/properties" xmlns:xsi="http://www.w3.org/2001/XMLSchema-instance" xmlns:pc="http://schemas.microsoft.com/office/infopath/2007/PartnerControls">
   <documentManagement>
@@ -18682,6 +18919,14 @@
 </file>
 
 <file path=customXml/itemProps1.xml><?xml version="1.0" encoding="utf-8"?>
+<ds:datastoreItem xmlns:ds="http://schemas.openxmlformats.org/officeDocument/2006/customXml" ds:itemID="{82EED737-999D-430D-BB13-B55BCBEF8CD3}">
+  <ds:schemaRefs>
+    <ds:schemaRef ds:uri="http://schemas.microsoft.com/sharepoint/v3/contenttype/forms"/>
+  </ds:schemaRefs>
+</ds:datastoreItem>
+</file>
+
+<file path=customXml/itemProps2.xml><?xml version="1.0" encoding="utf-8"?>
 <ds:datastoreItem xmlns:ds="http://schemas.openxmlformats.org/officeDocument/2006/customXml" ds:itemID="{E3DC2D59-DB5B-4EAF-BF4B-86942C28552E}">
   <ds:schemaRefs>
     <ds:schemaRef ds:uri="http://schemas.microsoft.com/office/2006/metadata/contentType"/>
@@ -18699,14 +18944,6 @@
 </ds:datastoreItem>
 </file>
 
-<file path=customXml/itemProps2.xml><?xml version="1.0" encoding="utf-8"?>
-<ds:datastoreItem xmlns:ds="http://schemas.openxmlformats.org/officeDocument/2006/customXml" ds:itemID="{82EED737-999D-430D-BB13-B55BCBEF8CD3}">
-  <ds:schemaRefs>
-    <ds:schemaRef ds:uri="http://schemas.microsoft.com/sharepoint/v3/contenttype/forms"/>
-  </ds:schemaRefs>
-</ds:datastoreItem>
-</file>
-
 <file path=customXml/itemProps3.xml><?xml version="1.0" encoding="utf-8"?>
 <ds:datastoreItem xmlns:ds="http://schemas.openxmlformats.org/officeDocument/2006/customXml" ds:itemID="{2B0A1CF6-C588-4E49-9D26-36301E052649}">
   <ds:schemaRefs>

</xml_diff>

<commit_message>
aggiunti credits + agg. doc
</commit_message>
<xml_diff>
--- a/doc/Documentazione BariGo (1).docx
+++ b/doc/Documentazione BariGo (1).docx
@@ -2543,10 +2543,9 @@
       </w:r>
       <w:r>
         <w:rPr>
-          <w:color w:val="EE0000"/>
           <w:szCs w:val="22"/>
         </w:rPr>
-        <w:t>DA SCRIVERE</w:t>
+        <w:t>Il completamento delle varie missioni nei teatri sparsi per la mappa permette di accumulare esperienza riempiendo la barra in alto, che fungerà da indicatore per la percentuale di completamento dell’esplorazione.</w:t>
       </w:r>
     </w:p>
     <w:p>
@@ -4115,14 +4114,13 @@
         <w:t xml:space="preserve">, l'avanzamento dei dialoghi e l'apertura dei menu contestuali (come il </w:t>
       </w:r>
       <w:r>
-        <w:rPr>
-          <w:b/>
-          <w:bCs/>
-        </w:rPr>
         <w:t>Taccuino Storico</w:t>
       </w:r>
       <w:r>
-        <w:t xml:space="preserve">, che funge da registro persistente dei progressi) sono gestiti interamente tramite il </w:t>
+        <w:t xml:space="preserve">) </w:t>
+      </w:r>
+      <w:r>
+        <w:t xml:space="preserve">sono gestiti interamente tramite il </w:t>
       </w:r>
       <w:r>
         <w:rPr>
@@ -4136,6 +4134,9 @@
       </w:r>
       <w:r>
         <w:t>.</w:t>
+      </w:r>
+      <w:r>
+        <w:t xml:space="preserve"> L’utilizzo del mouse è previsto per la selezione delle scelte previste dei vari menu (iniziale/di pausa), e per il controllo dello slider implementato nel menù opzioni per la regolazione del volume di musiche ed effetti sonori.</w:t>
       </w:r>
     </w:p>
     <w:p>
@@ -4226,16 +4227,16 @@
         <w:t xml:space="preserve"> </w:t>
       </w:r>
       <w:r>
+        <w:t>Kenney.nl</w:t>
+      </w:r>
+      <w:r>
+        <w:t xml:space="preserve"> </w:t>
+      </w:r>
+      <w:r>
         <w:rPr>
           <w:color w:val="EE0000"/>
         </w:rPr>
-        <w:t>Kenney.nl</w:t>
-      </w:r>
-      <w:r>
-        <w:rPr>
-          <w:color w:val="EE0000"/>
-        </w:rPr>
-        <w:t xml:space="preserve"> Upbeat.io</w:t>
+        <w:t>Upbeat.io</w:t>
       </w:r>
       <w:r>
         <w:rPr>
@@ -8927,7 +8928,7 @@
         <w:t>Bari Sopra</w:t>
       </w:r>
       <w:r>
-        <w:t xml:space="preserve">) sono stati estratti e ottimizzati </w:t>
+        <w:t xml:space="preserve">) sono stati estratti </w:t>
       </w:r>
       <w:r>
         <w:rPr>
@@ -10982,20 +10983,22 @@
       <w:r>
         <w:t>:</w:t>
       </w:r>
-      <w:r>
-        <w:br/>
-      </w:r>
-    </w:p>
-    <w:p>
+    </w:p>
+    <w:p>
+      <w:pPr>
+        <w:rPr>
+          <w:u w:val="single"/>
+        </w:rPr>
+      </w:pPr>
       <w:r>
         <w:rPr>
           <w:noProof/>
         </w:rPr>
         <w:drawing>
-          <wp:inline distT="0" distB="0" distL="0" distR="0" wp14:anchorId="7678BF2C" wp14:editId="2EDE4609">
-            <wp:extent cx="6116320" cy="6522810"/>
+          <wp:inline distT="0" distB="0" distL="0" distR="0" wp14:anchorId="39C29E47" wp14:editId="03FCEA10">
+            <wp:extent cx="6116245" cy="7254641"/>
             <wp:effectExtent l="0" t="0" r="0" b="0"/>
-            <wp:docPr id="788856210" name="Immagine 8"/>
+            <wp:docPr id="1192199925" name="Immagine 5"/>
             <wp:cNvGraphicFramePr>
               <a:graphicFrameLocks xmlns:a="http://schemas.openxmlformats.org/drawingml/2006/main" noChangeAspect="1"/>
             </wp:cNvGraphicFramePr>
@@ -11003,7 +11006,7 @@
               <a:graphicData uri="http://schemas.openxmlformats.org/drawingml/2006/picture">
                 <pic:pic xmlns:pic="http://schemas.openxmlformats.org/drawingml/2006/picture">
                   <pic:nvPicPr>
-                    <pic:cNvPr id="788856210" name="Immagine 788856210"/>
+                    <pic:cNvPr id="1192199925" name="Immagine 1192199925"/>
                     <pic:cNvPicPr/>
                   </pic:nvPicPr>
                   <pic:blipFill rotWithShape="1">
@@ -11014,7 +11017,7 @@
                         </a:ext>
                       </a:extLst>
                     </a:blip>
-                    <a:srcRect t="5369"/>
+                    <a:srcRect t="4418"/>
                     <a:stretch>
                       <a:fillRect/>
                     </a:stretch>
@@ -11022,7 +11025,7 @@
                   <pic:spPr bwMode="auto">
                     <a:xfrm>
                       <a:off x="0" y="0"/>
-                      <a:ext cx="6116320" cy="6522810"/>
+                      <a:ext cx="6135390" cy="7277349"/>
                     </a:xfrm>
                     <a:prstGeom prst="rect">
                       <a:avLst/>
@@ -11048,6 +11051,7 @@
         <w:br w:type="page"/>
       </w:r>
     </w:p>
+    <w:p/>
     <w:p>
       <w:pPr>
         <w:pStyle w:val="Paragrafoelenco"/>
@@ -11057,7 +11061,6 @@
         </w:numPr>
       </w:pPr>
       <w:r>
-        <w:lastRenderedPageBreak/>
         <w:t xml:space="preserve">Flowchart di </w:t>
       </w:r>
       <w:r>
@@ -11095,7 +11098,7 @@
           <w:noProof/>
         </w:rPr>
         <w:drawing>
-          <wp:inline distT="0" distB="0" distL="0" distR="0" wp14:anchorId="2D69741C" wp14:editId="3AD33B95">
+          <wp:inline distT="0" distB="0" distL="0" distR="0" wp14:anchorId="2D69741C" wp14:editId="0431DE5C">
             <wp:extent cx="6116320" cy="7671526"/>
             <wp:effectExtent l="0" t="0" r="0" b="0"/>
             <wp:docPr id="1471364459" name="Immagine 9"/>
@@ -11202,10 +11205,10 @@
           <w:noProof/>
         </w:rPr>
         <w:drawing>
-          <wp:inline distT="0" distB="0" distL="0" distR="0" wp14:anchorId="6AE0EECF" wp14:editId="05D57979">
-            <wp:extent cx="6116212" cy="5145858"/>
+          <wp:inline distT="0" distB="0" distL="0" distR="0" wp14:anchorId="5FEF3846" wp14:editId="32917341">
+            <wp:extent cx="6116320" cy="6540199"/>
             <wp:effectExtent l="0" t="0" r="0" b="0"/>
-            <wp:docPr id="2118772023" name="Immagine 9"/>
+            <wp:docPr id="1519744685" name="Immagine 3"/>
             <wp:cNvGraphicFramePr>
               <a:graphicFrameLocks xmlns:a="http://schemas.openxmlformats.org/drawingml/2006/main" noChangeAspect="1"/>
             </wp:cNvGraphicFramePr>
@@ -11213,7 +11216,7 @@
               <a:graphicData uri="http://schemas.openxmlformats.org/drawingml/2006/picture">
                 <pic:pic xmlns:pic="http://schemas.openxmlformats.org/drawingml/2006/picture">
                   <pic:nvPicPr>
-                    <pic:cNvPr id="2118772023" name="Immagine 2118772023"/>
+                    <pic:cNvPr id="1519744685" name="Immagine 1519744685"/>
                     <pic:cNvPicPr/>
                   </pic:nvPicPr>
                   <pic:blipFill rotWithShape="1">
@@ -11224,7 +11227,7 @@
                         </a:ext>
                       </a:extLst>
                     </a:blip>
-                    <a:srcRect t="6432"/>
+                    <a:srcRect t="5064"/>
                     <a:stretch>
                       <a:fillRect/>
                     </a:stretch>
@@ -11232,7 +11235,7 @@
                   <pic:spPr bwMode="auto">
                     <a:xfrm>
                       <a:off x="0" y="0"/>
-                      <a:ext cx="6116320" cy="5145949"/>
+                      <a:ext cx="6116320" cy="6540199"/>
                     </a:xfrm>
                     <a:prstGeom prst="rect">
                       <a:avLst/>
@@ -11270,8 +11273,8 @@
           <w:noProof/>
         </w:rPr>
         <w:drawing>
-          <wp:inline distT="0" distB="0" distL="0" distR="0" wp14:anchorId="0CDD2137" wp14:editId="18C148D1">
-            <wp:extent cx="6116320" cy="3319780"/>
+          <wp:inline distT="0" distB="0" distL="0" distR="0" wp14:anchorId="0CDD2137" wp14:editId="2C2C7F21">
+            <wp:extent cx="6116171" cy="3319780"/>
             <wp:effectExtent l="0" t="0" r="0" b="0"/>
             <wp:docPr id="8968053" name="Immagine 5"/>
             <wp:cNvGraphicFramePr>
@@ -11281,7 +11284,7 @@
               <a:graphicData uri="http://schemas.openxmlformats.org/drawingml/2006/picture">
                 <pic:pic xmlns:pic="http://schemas.openxmlformats.org/drawingml/2006/picture">
                   <pic:nvPicPr>
-                    <pic:cNvPr id="8968053" name="Immagine 8968053"/>
+                    <pic:cNvPr id="8968053" name="Immagine 5"/>
                     <pic:cNvPicPr/>
                   </pic:nvPicPr>
                   <pic:blipFill>
@@ -11299,7 +11302,7 @@
                   <pic:spPr>
                     <a:xfrm>
                       <a:off x="0" y="0"/>
-                      <a:ext cx="6116320" cy="3319780"/>
+                      <a:ext cx="6116171" cy="3319780"/>
                     </a:xfrm>
                     <a:prstGeom prst="rect">
                       <a:avLst/>
@@ -11505,8 +11508,8 @@
           <w:noProof/>
         </w:rPr>
         <w:drawing>
-          <wp:inline distT="0" distB="0" distL="0" distR="0" wp14:anchorId="0F712486" wp14:editId="523B0387">
-            <wp:extent cx="6116320" cy="3368675"/>
+          <wp:inline distT="0" distB="0" distL="0" distR="0" wp14:anchorId="0F712486" wp14:editId="0911CF74">
+            <wp:extent cx="6115794" cy="3368675"/>
             <wp:effectExtent l="0" t="0" r="0" b="3175"/>
             <wp:docPr id="1822982663" name="Immagine 8"/>
             <wp:cNvGraphicFramePr>
@@ -11516,11 +11519,69 @@
               <a:graphicData uri="http://schemas.openxmlformats.org/drawingml/2006/picture">
                 <pic:pic xmlns:pic="http://schemas.openxmlformats.org/drawingml/2006/picture">
                   <pic:nvPicPr>
-                    <pic:cNvPr id="1822982663" name="Immagine 1822982663"/>
+                    <pic:cNvPr id="1822982663" name="Immagine 8"/>
                     <pic:cNvPicPr/>
                   </pic:nvPicPr>
                   <pic:blipFill>
                     <a:blip r:embed="rId29" cstate="print">
+                      <a:extLst>
+                        <a:ext uri="{28A0092B-C50C-407E-A947-70E740481C1C}">
+                          <a14:useLocalDpi xmlns:a14="http://schemas.microsoft.com/office/drawing/2010/main" val="0"/>
+                        </a:ext>
+                      </a:extLst>
+                    </a:blip>
+                    <a:stretch>
+                      <a:fillRect/>
+                    </a:stretch>
+                  </pic:blipFill>
+                  <pic:spPr>
+                    <a:xfrm>
+                      <a:off x="0" y="0"/>
+                      <a:ext cx="6115794" cy="3368675"/>
+                    </a:xfrm>
+                    <a:prstGeom prst="rect">
+                      <a:avLst/>
+                    </a:prstGeom>
+                  </pic:spPr>
+                </pic:pic>
+              </a:graphicData>
+            </a:graphic>
+          </wp:inline>
+        </w:drawing>
+      </w:r>
+      <w:commentRangeEnd w:id="23"/>
+      <w:r>
+        <w:rPr>
+          <w:rStyle w:val="Rimandocommento"/>
+          <w:sz w:val="24"/>
+          <w:szCs w:val="24"/>
+        </w:rPr>
+        <w:commentReference w:id="23"/>
+      </w:r>
+    </w:p>
+    <w:p>
+      <w:r>
+        <w:rPr>
+          <w:noProof/>
+        </w:rPr>
+        <w:lastRenderedPageBreak/>
+        <w:drawing>
+          <wp:inline distT="0" distB="0" distL="0" distR="0" wp14:anchorId="3422741F" wp14:editId="794FE504">
+            <wp:extent cx="6116320" cy="3368675"/>
+            <wp:effectExtent l="0" t="0" r="0" b="3175"/>
+            <wp:docPr id="786929954" name="Immagine 4"/>
+            <wp:cNvGraphicFramePr>
+              <a:graphicFrameLocks xmlns:a="http://schemas.openxmlformats.org/drawingml/2006/main" noChangeAspect="1"/>
+            </wp:cNvGraphicFramePr>
+            <a:graphic xmlns:a="http://schemas.openxmlformats.org/drawingml/2006/main">
+              <a:graphicData uri="http://schemas.openxmlformats.org/drawingml/2006/picture">
+                <pic:pic xmlns:pic="http://schemas.openxmlformats.org/drawingml/2006/picture">
+                  <pic:nvPicPr>
+                    <pic:cNvPr id="786929954" name="Immagine 786929954"/>
+                    <pic:cNvPicPr/>
+                  </pic:nvPicPr>
+                  <pic:blipFill>
+                    <a:blip r:embed="rId30" cstate="print">
                       <a:extLst>
                         <a:ext uri="{28A0092B-C50C-407E-A947-70E740481C1C}">
                           <a14:useLocalDpi xmlns:a14="http://schemas.microsoft.com/office/drawing/2010/main" val="0"/>
@@ -11546,16 +11607,8 @@
           </wp:inline>
         </w:drawing>
       </w:r>
-      <w:commentRangeEnd w:id="23"/>
-      <w:r>
-        <w:rPr>
-          <w:rStyle w:val="Rimandocommento"/>
-          <w:sz w:val="24"/>
-          <w:szCs w:val="24"/>
-        </w:rPr>
-        <w:commentReference w:id="23"/>
-      </w:r>
-    </w:p>
+    </w:p>
+    <w:p/>
     <w:p>
       <w:pPr>
         <w:rPr>
@@ -16101,9 +16154,9 @@
     </w:p>
     <w:p/>
     <w:sectPr>
-      <w:headerReference w:type="default" r:id="rId30"/>
-      <w:footerReference w:type="even" r:id="rId31"/>
-      <w:footerReference w:type="default" r:id="rId32"/>
+      <w:headerReference w:type="default" r:id="rId31"/>
+      <w:footerReference w:type="even" r:id="rId32"/>
+      <w:footerReference w:type="default" r:id="rId33"/>
       <w:pgSz w:w="11900" w:h="16840"/>
       <w:pgMar w:top="2131" w:right="1134" w:bottom="1134" w:left="1134" w:header="708" w:footer="708" w:gutter="0"/>
       <w:cols w:space="708"/>
@@ -16176,9 +16229,33 @@
 
 <file path=word/commentsExtensible.xml><?xml version="1.0" encoding="utf-8"?>
 <w16cex:commentsExtensible xmlns:wpc="http://schemas.microsoft.com/office/word/2010/wordprocessingCanvas" xmlns:cx="http://schemas.microsoft.com/office/drawing/2014/chartex" xmlns:cx1="http://schemas.microsoft.com/office/drawing/2015/9/8/chartex" xmlns:cx2="http://schemas.microsoft.com/office/drawing/2015/10/21/chartex" xmlns:cx3="http://schemas.microsoft.com/office/drawing/2016/5/9/chartex" xmlns:cx4="http://schemas.microsoft.com/office/drawing/2016/5/10/chartex" xmlns:cx5="http://schemas.microsoft.com/office/drawing/2016/5/11/chartex" xmlns:cx6="http://schemas.microsoft.com/office/drawing/2016/5/12/chartex" xmlns:cx7="http://schemas.microsoft.com/office/drawing/2016/5/13/chartex" xmlns:cx8="http://schemas.microsoft.com/office/drawing/2016/5/14/chartex" xmlns:cr="http://schemas.microsoft.com/office/comments/2020/reactions" xmlns:mc="http://schemas.openxmlformats.org/markup-compatibility/2006" xmlns:aink="http://schemas.microsoft.com/office/drawing/2016/ink" xmlns:am3d="http://schemas.microsoft.com/office/drawing/2017/model3d" xmlns:o="urn:schemas-microsoft-com:office:office" xmlns:oel="http://schemas.microsoft.com/office/2019/extlst" xmlns:r="http://schemas.openxmlformats.org/officeDocument/2006/relationships" xmlns:m="http://schemas.openxmlformats.org/officeDocument/2006/math" xmlns:v="urn:schemas-microsoft-com:vml" xmlns:wp14="http://schemas.microsoft.com/office/word/2010/wordprocessingDrawing" xmlns:wp="http://schemas.openxmlformats.org/drawingml/2006/wordprocessingDrawing" xmlns:w10="urn:schemas-microsoft-com:office:word" xmlns:w="http://schemas.openxmlformats.org/wordprocessingml/2006/main" xmlns:w14="http://schemas.microsoft.com/office/word/2010/wordml" xmlns:w15="http://schemas.microsoft.com/office/word/2012/wordml" xmlns:w16cex="http://schemas.microsoft.com/office/word/2018/wordml/cex" xmlns:w16cid="http://schemas.microsoft.com/office/word/2016/wordml/cid" xmlns:w16="http://schemas.microsoft.com/office/word/2018/wordml" xmlns:w16du="http://schemas.microsoft.com/office/word/2023/wordml/word16du" xmlns:w16sdtdh="http://schemas.microsoft.com/office/word/2020/wordml/sdtdatahash" xmlns:w16sdtfl="http://schemas.microsoft.com/office/word/2024/wordml/sdtformatlock" xmlns:w16se="http://schemas.microsoft.com/office/word/2015/wordml/symex" xmlns:wpg="http://schemas.microsoft.com/office/word/2010/wordprocessingGroup" xmlns:wpi="http://schemas.microsoft.com/office/word/2010/wordprocessingInk" xmlns:wne="http://schemas.microsoft.com/office/word/2006/wordml" xmlns:wps="http://schemas.microsoft.com/office/word/2010/wordprocessingShape" mc:Ignorable="w14 w15 w16se w16cid w16 w16cex w16sdtdh w16sdtfl cr w16du wp14">
-  <w16cex:commentExtensible w16cex:durableId="35824A39" w16cex:dateUtc="2026-06-17T15:39:00Z"/>
+  <w16cex:commentExtensible w16cex:durableId="35824A39" w16cex:dateUtc="2026-06-17T15:39:00Z">
+    <w16cex:extLst>
+      <w16:ext w16:uri="{CE6994B0-6A32-4C9F-8C6B-6E91EDA988CE}">
+        <cr:reactions xmlns:cr="http://schemas.microsoft.com/office/comments/2020/reactions">
+          <cr:reaction reactionType="1">
+            <cr:reactionInfo dateUtc="2026-06-18T09:40:47Z">
+              <cr:user userId="S::c.giove10@studenti.uniba.it::9a7f5267-3ce6-44e7-b146-bd6a04b4bf67" userProvider="AD" userName="GIOVE CARMINE"/>
+            </cr:reactionInfo>
+          </cr:reaction>
+        </cr:reactions>
+      </w16:ext>
+    </w16cex:extLst>
+  </w16cex:commentExtensible>
   <w16cex:commentExtensible w16cex:durableId="48ABCCEB" w16cex:dateUtc="2026-06-17T15:42:00Z"/>
-  <w16cex:commentExtensible w16cex:durableId="410877B1" w16cex:dateUtc="2026-06-17T16:04:00Z"/>
+  <w16cex:commentExtensible w16cex:durableId="410877B1" w16cex:dateUtc="2026-06-17T16:04:00Z">
+    <w16cex:extLst>
+      <w16:ext w16:uri="{CE6994B0-6A32-4C9F-8C6B-6E91EDA988CE}">
+        <cr:reactions xmlns:cr="http://schemas.microsoft.com/office/comments/2020/reactions">
+          <cr:reaction reactionType="1">
+            <cr:reactionInfo dateUtc="2026-06-18T10:19:37Z">
+              <cr:user userId="S::c.giove10@studenti.uniba.it::9a7f5267-3ce6-44e7-b146-bd6a04b4bf67" userProvider="AD" userName="GIOVE CARMINE"/>
+            </cr:reactionInfo>
+          </cr:reaction>
+        </cr:reactions>
+      </w16:ext>
+    </w16cex:extLst>
+  </w16cex:commentExtensible>
 </w16cex:commentsExtensible>
 </file>
 
@@ -23973,6 +24050,7 @@
   <w:style w:type="character" w:default="1" w:styleId="Carpredefinitoparagrafo">
     <w:name w:val="Default Paragraph Font"/>
     <w:uiPriority w:val="1"/>
+    <w:semiHidden/>
     <w:unhideWhenUsed/>
   </w:style>
   <w:style w:type="table" w:default="1" w:styleId="Tabellanormale">
@@ -25417,6 +25495,14 @@
 </file>
 
 <file path=customXml/item1.xml><?xml version="1.0" encoding="utf-8"?>
+<p:properties xmlns:p="http://schemas.microsoft.com/office/2006/metadata/properties" xmlns:xsi="http://www.w3.org/2001/XMLSchema-instance" xmlns:pc="http://schemas.microsoft.com/office/infopath/2007/PartnerControls">
+  <documentManagement>
+    <_activity xmlns="1682274c-17d2-4eb1-91bb-64e0444dc755" xsi:nil="true"/>
+  </documentManagement>
+</p:properties>
+</file>
+
+<file path=customXml/item2.xml><?xml version="1.0" encoding="utf-8"?>
 <?mso-contentType ?>
 <FormTemplates xmlns="http://schemas.microsoft.com/sharepoint/v3/contenttype/forms">
   <Display>DocumentLibraryForm</Display>
@@ -25425,15 +25511,11 @@
 </FormTemplates>
 </file>
 
-<file path=customXml/item2.xml><?xml version="1.0" encoding="utf-8"?>
-<p:properties xmlns:p="http://schemas.microsoft.com/office/2006/metadata/properties" xmlns:xsi="http://www.w3.org/2001/XMLSchema-instance" xmlns:pc="http://schemas.microsoft.com/office/infopath/2007/PartnerControls">
-  <documentManagement>
-    <_activity xmlns="1682274c-17d2-4eb1-91bb-64e0444dc755" xsi:nil="true"/>
-  </documentManagement>
-</p:properties>
+<file path=customXml/item3.xml><?xml version="1.0" encoding="utf-8"?>
+<b:Sources xmlns:b="http://schemas.openxmlformats.org/officeDocument/2006/bibliography" xmlns="http://schemas.openxmlformats.org/officeDocument/2006/bibliography" SelectedStyle="\APASixthEditionOfficeOnline.xsl" StyleName="APA" Version="6"/>
 </file>
 
-<file path=customXml/item3.xml><?xml version="1.0" encoding="utf-8"?>
+<file path=customXml/item4.xml><?xml version="1.0" encoding="utf-8"?>
 <ct:contentTypeSchema xmlns:ct="http://schemas.microsoft.com/office/2006/metadata/contentType" xmlns:ma="http://schemas.microsoft.com/office/2006/metadata/properties/metaAttributes" ct:_="" ma:_="" ma:contentTypeName="Documento" ma:contentTypeID="0x010100483500D60DFCF744AD254A79C2671EC4" ma:contentTypeVersion="5" ma:contentTypeDescription="Creare un nuovo documento." ma:contentTypeScope="" ma:versionID="7b665a2209f67cd04619df273567bc5b">
   <xsd:schema xmlns:xsd="http://www.w3.org/2001/XMLSchema" xmlns:xs="http://www.w3.org/2001/XMLSchema" xmlns:p="http://schemas.microsoft.com/office/2006/metadata/properties" xmlns:ns3="1682274c-17d2-4eb1-91bb-64e0444dc755" targetNamespace="http://schemas.microsoft.com/office/2006/metadata/properties" ma:root="true" ma:fieldsID="09422ce98116468340c6fac1dc03f610" ns3:_="">
     <xsd:import namespace="1682274c-17d2-4eb1-91bb-64e0444dc755"/>
@@ -25583,19 +25665,7 @@
 </ct:contentTypeSchema>
 </file>
 
-<file path=customXml/item4.xml><?xml version="1.0" encoding="utf-8"?>
-<b:Sources xmlns:b="http://schemas.openxmlformats.org/officeDocument/2006/bibliography" xmlns="http://schemas.openxmlformats.org/officeDocument/2006/bibliography" SelectedStyle="\APASixthEditionOfficeOnline.xsl" StyleName="APA" Version="6"/>
-</file>
-
 <file path=customXml/itemProps1.xml><?xml version="1.0" encoding="utf-8"?>
-<ds:datastoreItem xmlns:ds="http://schemas.openxmlformats.org/officeDocument/2006/customXml" ds:itemID="{82EED737-999D-430D-BB13-B55BCBEF8CD3}">
-  <ds:schemaRefs>
-    <ds:schemaRef ds:uri="http://schemas.microsoft.com/sharepoint/v3/contenttype/forms"/>
-  </ds:schemaRefs>
-</ds:datastoreItem>
-</file>
-
-<file path=customXml/itemProps2.xml><?xml version="1.0" encoding="utf-8"?>
 <ds:datastoreItem xmlns:ds="http://schemas.openxmlformats.org/officeDocument/2006/customXml" ds:itemID="{2B0A1CF6-C588-4E49-9D26-36301E052649}">
   <ds:schemaRefs>
     <ds:schemaRef ds:uri="http://schemas.microsoft.com/office/2006/metadata/properties"/>
@@ -25605,7 +25675,23 @@
 </ds:datastoreItem>
 </file>
 
+<file path=customXml/itemProps2.xml><?xml version="1.0" encoding="utf-8"?>
+<ds:datastoreItem xmlns:ds="http://schemas.openxmlformats.org/officeDocument/2006/customXml" ds:itemID="{82EED737-999D-430D-BB13-B55BCBEF8CD3}">
+  <ds:schemaRefs>
+    <ds:schemaRef ds:uri="http://schemas.microsoft.com/sharepoint/v3/contenttype/forms"/>
+  </ds:schemaRefs>
+</ds:datastoreItem>
+</file>
+
 <file path=customXml/itemProps3.xml><?xml version="1.0" encoding="utf-8"?>
+<ds:datastoreItem xmlns:ds="http://schemas.openxmlformats.org/officeDocument/2006/customXml" ds:itemID="{C558AB56-52E2-4A7D-BACD-F7E2C9501F8A}">
+  <ds:schemaRefs>
+    <ds:schemaRef ds:uri="http://schemas.openxmlformats.org/officeDocument/2006/bibliography"/>
+  </ds:schemaRefs>
+</ds:datastoreItem>
+</file>
+
+<file path=customXml/itemProps4.xml><?xml version="1.0" encoding="utf-8"?>
 <ds:datastoreItem xmlns:ds="http://schemas.openxmlformats.org/officeDocument/2006/customXml" ds:itemID="{E3DC2D59-DB5B-4EAF-BF4B-86942C28552E}">
   <ds:schemaRefs>
     <ds:schemaRef ds:uri="http://schemas.microsoft.com/office/2006/metadata/contentType"/>
@@ -25621,12 +25707,4 @@
     <ds:schemaRef ds:uri="http://schemas.microsoft.com/internal/obd"/>
   </ds:schemaRefs>
 </ds:datastoreItem>
-</file>
-
-<file path=customXml/itemProps4.xml><?xml version="1.0" encoding="utf-8"?>
-<ds:datastoreItem xmlns:ds="http://schemas.openxmlformats.org/officeDocument/2006/customXml" ds:itemID="{C558AB56-52E2-4A7D-BACD-F7E2C9501F8A}">
-  <ds:schemaRefs>
-    <ds:schemaRef ds:uri="http://schemas.openxmlformats.org/officeDocument/2006/bibliography"/>
-  </ds:schemaRefs>
-</ds:datastoreItem>
 </file>
</xml_diff>